<commit_message>
test: pruebas unitarias con pytest (41 ejecuciones) e informe de pruebas con su sección
- tests/test_unitarias.py: reglas de negocio probadas de forma aislada (stubs de la
  sesión, de la orden y de la consulta SQL), con valores límite y particiones.
- Informe de pruebas: nueva sección 5 (unidad, quién/cómo/cuándo, driver pytest vs
  JUnit/TestNG, ejemplos, resultados por unidad, criterio de liberación).
- Documentos y README: 267 pruebas (226 de integración/funcionales + 41 unitarias).

Co-Authored-By: Claude Opus 5.5 <noreply@anthropic.com>
</commit_message>
<xml_diff>
--- a/docs/entrega-2do-corte/03_Verificacion_y_validacion/Informe_de_Pruebas_Realizadas_StockPot.docx
+++ b/docs/entrega-2do-corte/03_Verificacion_y_validacion/Informe_de_Pruebas_Realizadas_StockPot.docx
@@ -202,7 +202,7 @@
               <w:rPr>
                 <w:sz w:val="20"/>
               </w:rPr>
-              <w:t>Ángel David Rodríguez Vega (Líder del proyecto (Project Manager) – Iteración 4); Andrés Mateo ____ (Desarrollador – Iteración 1); Jhorman ____ (Desarrollador – Iteración 2); Yovany Peñaranda ____ (Desarrollador – Iteración 3)</w:t>
+              <w:t>Ángel David Rodríguez Vega (Líder del proyecto (Project Manager) – Iteración 4); Andrés Mateo ____ (Desarrollador – Iteración 1); Jhorman Caballero (Desarrollador – Iteración 2); Yovany Peñaranda (Desarrollador – Iteración 3)</w:t>
             </w:r>
           </w:p>
         </w:tc>
@@ -282,7 +282,7 @@
     </w:p>
     <w:p>
       <w:r>
-        <w:t>Se probaron los 8 módulos que forman el 70 % del software (Iteraciones 1, 2 y 4). Se ejecutaron 226 pruebas automatizadas (186 casos, algunos con varios juegos de datos) y 33 casos funcionales CRUD manuales en la interfaz web. Resultado: 226 de 226 pruebas automatizadas aprobadas (100 %), 33 de 33 casos CRUD aprobados y una cobertura de código del backend del 95 %. Durante el desarrollo se registraron 9 defectos; todos fueron corregidos y verificados antes de la entrega. No quedan defectos abiertos.</w:t>
+        <w:t>Se probaron los 8 módulos que forman el 70 % del software (Iteraciones 1, 2 y 4). Se ejecutaron 267 pruebas automatizadas (205 casos, algunos con varios juegos de datos): 41 unitarias sobre las reglas de negocio y el resto de integración y funcionales a través de la API. Además se ejecutaron 33 casos funcionales CRUD manuales en la interfaz web. Resultado: 267 de 267 pruebas automatizadas aprobadas (100 %), 33 de 33 casos CRUD aprobados y una cobertura de código del backend del 95 %. Durante el desarrollo se registraron 9 defectos; todos fueron corregidos y verificados antes de la entrega. No quedan defectos abiertos.</w:t>
       </w:r>
     </w:p>
     <w:tbl>
@@ -354,7 +354,37 @@
               <w:rPr>
                 <w:sz w:val="18"/>
               </w:rPr>
-              <w:t>226 / 226 (100 %)</w:t>
+              <w:t>267 / 267 (100 %)</w:t>
+            </w:r>
+          </w:p>
+        </w:tc>
+      </w:tr>
+      <w:tr>
+        <w:tc>
+          <w:tcPr>
+            <w:tcW w:type="dxa" w:w="5102"/>
+          </w:tcPr>
+          <w:p>
+            <w:r/>
+            <w:r>
+              <w:rPr>
+                <w:sz w:val="18"/>
+              </w:rPr>
+              <w:t xml:space="preserve">   de ellas, pruebas unitarias (pytest)</w:t>
+            </w:r>
+          </w:p>
+        </w:tc>
+        <w:tc>
+          <w:tcPr>
+            <w:tcW w:type="dxa" w:w="3969"/>
+          </w:tcPr>
+          <w:p>
+            <w:r/>
+            <w:r>
+              <w:rPr>
+                <w:sz w:val="18"/>
+              </w:rPr>
+              <w:t>41 / 41 (100 %)</w:t>
             </w:r>
           </w:p>
         </w:tc>
@@ -700,7 +730,7 @@
               <w:rPr>
                 <w:sz w:val="18"/>
               </w:rPr>
-              <w:t>Unitarias y de integración de la API</w:t>
+              <w:t>Unitarias</w:t>
             </w:r>
           </w:p>
         </w:tc>
@@ -714,7 +744,7 @@
               <w:rPr>
                 <w:sz w:val="18"/>
               </w:rPr>
-              <w:t>Caja blanca</w:t>
+              <w:t>Caja negra y caja blanca</w:t>
             </w:r>
           </w:p>
         </w:tc>
@@ -728,6 +758,64 @@
               <w:rPr>
                 <w:sz w:val="18"/>
               </w:rPr>
+              <w:t>pytest 9 (driver) + stubs, sin base de datos</w:t>
+            </w:r>
+          </w:p>
+        </w:tc>
+        <w:tc>
+          <w:tcPr>
+            <w:tcW w:type="dxa" w:w="3628"/>
+          </w:tcPr>
+          <w:p>
+            <w:r/>
+            <w:r>
+              <w:rPr>
+                <w:sz w:val="18"/>
+              </w:rPr>
+              <w:t>Cada regla de negocio por separado: una función o un método (sección 5).</w:t>
+            </w:r>
+          </w:p>
+        </w:tc>
+      </w:tr>
+      <w:tr>
+        <w:tc>
+          <w:tcPr>
+            <w:tcW w:type="dxa" w:w="2041"/>
+          </w:tcPr>
+          <w:p>
+            <w:r/>
+            <w:r>
+              <w:rPr>
+                <w:sz w:val="18"/>
+              </w:rPr>
+              <w:t>Integración de la API</w:t>
+            </w:r>
+          </w:p>
+        </w:tc>
+        <w:tc>
+          <w:tcPr>
+            <w:tcW w:type="dxa" w:w="1247"/>
+          </w:tcPr>
+          <w:p>
+            <w:r/>
+            <w:r>
+              <w:rPr>
+                <w:sz w:val="18"/>
+              </w:rPr>
+              <w:t>Caja negra y caja blanca</w:t>
+            </w:r>
+          </w:p>
+        </w:tc>
+        <w:tc>
+          <w:tcPr>
+            <w:tcW w:type="dxa" w:w="2154"/>
+          </w:tcPr>
+          <w:p>
+            <w:r/>
+            <w:r>
+              <w:rPr>
+                <w:sz w:val="18"/>
+              </w:rPr>
               <w:t>pytest 9 + base SQLite en memoria</w:t>
             </w:r>
           </w:p>
@@ -742,7 +830,7 @@
               <w:rPr>
                 <w:sz w:val="18"/>
               </w:rPr>
-              <w:t>Reglas de negocio, validaciones, códigos HTTP y transacciones de cada endpoint (RF-xx.x).</w:t>
+              <w:t>Validaciones, códigos HTTP y transacciones de cada endpoint (RF-xx.x), con todas las capas unidas.</w:t>
             </w:r>
           </w:p>
         </w:tc>
@@ -1048,7 +1136,2387 @@
         <w:pStyle w:val="Heading1"/>
       </w:pPr>
       <w:r>
-        <w:t>5. Entorno de pruebas</w:t>
+        <w:t>5. Pruebas unitarias con pytest</w:t>
+      </w:r>
+    </w:p>
+    <w:p>
+      <w:r>
+        <w:t>Una prueba unitaria verifica una sola unidad de software de forma temprana y aislada. En Java esto se hace con JUnit o TestNG; en StockPot, que está escrito en Python, se usa pytest, que cumple el mismo papel. La suite unitaria tiene 19 casos y 41 ejecuciones (algunos casos usan varios juegos de datos), en el archivo backend/tests/test_unitarias.py. Resultado: 41 de 41 aprobadas en 0,48 s.</w:t>
+      </w:r>
+    </w:p>
+    <w:p>
+      <w:pPr>
+        <w:pStyle w:val="Heading2"/>
+      </w:pPr>
+      <w:r>
+        <w:t>5.1 Qué es una unidad en StockPot</w:t>
+      </w:r>
+    </w:p>
+    <w:p>
+      <w:r>
+        <w:t>Una unidad es una función o un método que implementa una regla de negocio y se puede llamar por sí solo: por ejemplo, el cálculo del estado del stock de un insumo, la regla «el inventario nunca queda negativo», el costo de un plato según su receta o el estado de pago de una orden. No son unidades las rutas de la API: esas unen varias capas (HTTP, permisos, base de datos) y se prueban en las pruebas de integración (sección 7).</w:t>
+      </w:r>
+    </w:p>
+    <w:p>
+      <w:pPr>
+        <w:pStyle w:val="Heading2"/>
+      </w:pPr>
+      <w:r>
+        <w:t>5.2 Quién, cómo y cuándo</w:t>
+      </w:r>
+    </w:p>
+    <w:p>
+      <w:pPr>
+        <w:pStyle w:val="ListBullet"/>
+      </w:pPr>
+      <w:r>
+        <w:t>Quién: las pruebas de cada unidad las escribe quien la construye, porque conoce la unidad y encuentra rápido el defecto cuando una prueba falla. Otro integrante las revisa en el Pull Request antes de integrarlas.</w:t>
+      </w:r>
+    </w:p>
+    <w:p>
+      <w:pPr>
+        <w:pStyle w:val="ListBullet"/>
+      </w:pPr>
+      <w:r>
+        <w:t>Cómo: se combinan técnicas de caja negra (los datos salen de la especificación del requisito: particiones de equivalencia y valores límite) y de caja blanca (que se ejecuten todas las sentencias y ramas de la unidad, medido con pytest-cov).</w:t>
+      </w:r>
+    </w:p>
+    <w:p>
+      <w:pPr>
+        <w:pStyle w:val="ListBullet"/>
+      </w:pPr>
+      <w:r>
+        <w:t>Cuándo: primero se diseña y se revisa la unidad y su código; después se ejecutan las pruebas, como validación de que la unidad ya está bien hecha. Así se evita el ciclo «codificar y remendar» (code-fix), en el que solo se corrige lo que las pruebas alcanzan a detectar.</w:t>
+      </w:r>
+    </w:p>
+    <w:p>
+      <w:pPr>
+        <w:pStyle w:val="ListBullet"/>
+      </w:pPr>
+      <w:r>
+        <w:t>Regresión: las pruebas quedan escritas y se ejecutan completas antes de cada integración en develop. Si un cambio rompe una regla que ya funcionaba, la prueba falla y el cambio no se integra.</w:t>
+      </w:r>
+    </w:p>
+    <w:p>
+      <w:pPr>
+        <w:pStyle w:val="Heading2"/>
+      </w:pPr>
+      <w:r>
+        <w:t>5.3 El driver: pytest</w:t>
+      </w:r>
+    </w:p>
+    <w:p>
+      <w:r>
+        <w:t>Un driver es el software que invoca la unidad bajo prueba: le entrega los datos de cada caso y compara el resultado obtenido con el esperado. Cuando la unidad depende de algo externo (la base de datos, una orden con sus pagos, una consulta SQL), ese elemento se reemplaza por un stub: un objeto en memoria que se comporta igual en lo que la unidad necesita, para que la prueba dependa solo de la unidad. La tabla compara las dos herramientas de Python con sus equivalentes de Java:</w:t>
+      </w:r>
+    </w:p>
+    <w:tbl>
+      <w:tblPr>
+        <w:tblStyle w:val="TableGrid"/>
+        <w:tblW w:type="auto" w:w="0"/>
+        <w:tblLook w:firstColumn="1" w:firstRow="1" w:lastColumn="0" w:lastRow="0" w:noHBand="0" w:noVBand="1" w:val="04A0"/>
+      </w:tblPr>
+      <w:tblGrid>
+        <w:gridCol w:w="2440"/>
+        <w:gridCol w:w="2440"/>
+        <w:gridCol w:w="2440"/>
+        <w:gridCol w:w="2440"/>
+      </w:tblGrid>
+      <w:tr>
+        <w:tc>
+          <w:tcPr>
+            <w:tcW w:type="dxa" w:w="1928"/>
+            <w:shd w:val="clear" w:color="auto" w:fill="F5DED5"/>
+          </w:tcPr>
+          <w:p>
+            <w:r/>
+            <w:r>
+              <w:rPr>
+                <w:b/>
+                <w:sz w:val="16"/>
+              </w:rPr>
+              <w:t>Característica</w:t>
+            </w:r>
+          </w:p>
+        </w:tc>
+        <w:tc>
+          <w:tcPr>
+            <w:tcW w:type="dxa" w:w="2041"/>
+            <w:shd w:val="clear" w:color="auto" w:fill="F5DED5"/>
+          </w:tcPr>
+          <w:p>
+            <w:r/>
+            <w:r>
+              <w:rPr>
+                <w:b/>
+                <w:sz w:val="16"/>
+              </w:rPr>
+              <w:t>Java (JUnit / TestNG)</w:t>
+            </w:r>
+          </w:p>
+        </w:tc>
+        <w:tc>
+          <w:tcPr>
+            <w:tcW w:type="dxa" w:w="2494"/>
+            <w:shd w:val="clear" w:color="auto" w:fill="F5DED5"/>
+          </w:tcPr>
+          <w:p>
+            <w:r/>
+            <w:r>
+              <w:rPr>
+                <w:b/>
+                <w:sz w:val="16"/>
+              </w:rPr>
+              <w:t>Python (unittest / pytest)</w:t>
+            </w:r>
+          </w:p>
+        </w:tc>
+        <w:tc>
+          <w:tcPr>
+            <w:tcW w:type="dxa" w:w="2608"/>
+            <w:shd w:val="clear" w:color="auto" w:fill="F5DED5"/>
+          </w:tcPr>
+          <w:p>
+            <w:r/>
+            <w:r>
+              <w:rPr>
+                <w:b/>
+                <w:sz w:val="16"/>
+              </w:rPr>
+              <w:t>Uso en StockPot</w:t>
+            </w:r>
+          </w:p>
+        </w:tc>
+      </w:tr>
+      <w:tr>
+        <w:tc>
+          <w:tcPr>
+            <w:tcW w:type="dxa" w:w="1928"/>
+          </w:tcPr>
+          <w:p>
+            <w:r/>
+            <w:r>
+              <w:rPr>
+                <w:sz w:val="16"/>
+              </w:rPr>
+              <w:t>Casos de prueba</w:t>
+            </w:r>
+          </w:p>
+        </w:tc>
+        <w:tc>
+          <w:tcPr>
+            <w:tcW w:type="dxa" w:w="2041"/>
+          </w:tcPr>
+          <w:p>
+            <w:r/>
+            <w:r>
+              <w:rPr>
+                <w:sz w:val="16"/>
+              </w:rPr>
+              <w:t>Métodos con @Test dentro de clases</w:t>
+            </w:r>
+          </w:p>
+        </w:tc>
+        <w:tc>
+          <w:tcPr>
+            <w:tcW w:type="dxa" w:w="2494"/>
+          </w:tcPr>
+          <w:p>
+            <w:r/>
+            <w:r>
+              <w:rPr>
+                <w:sz w:val="16"/>
+              </w:rPr>
+              <w:t>unittest: clases TestCase; pytest: funciones con assert</w:t>
+            </w:r>
+          </w:p>
+        </w:tc>
+        <w:tc>
+          <w:tcPr>
+            <w:tcW w:type="dxa" w:w="2608"/>
+          </w:tcPr>
+          <w:p>
+            <w:r/>
+            <w:r>
+              <w:rPr>
+                <w:sz w:val="16"/>
+              </w:rPr>
+              <w:t>pytest: funciones test_… con assert</w:t>
+            </w:r>
+          </w:p>
+        </w:tc>
+      </w:tr>
+      <w:tr>
+        <w:tc>
+          <w:tcPr>
+            <w:tcW w:type="dxa" w:w="1928"/>
+          </w:tcPr>
+          <w:p>
+            <w:r/>
+            <w:r>
+              <w:rPr>
+                <w:sz w:val="16"/>
+              </w:rPr>
+              <w:t>Datos parametrizados (data-driven)</w:t>
+            </w:r>
+          </w:p>
+        </w:tc>
+        <w:tc>
+          <w:tcPr>
+            <w:tcW w:type="dxa" w:w="2041"/>
+          </w:tcPr>
+          <w:p>
+            <w:r/>
+            <w:r>
+              <w:rPr>
+                <w:sz w:val="16"/>
+              </w:rPr>
+              <w:t>TestNG: @DataProvider</w:t>
+            </w:r>
+          </w:p>
+        </w:tc>
+        <w:tc>
+          <w:tcPr>
+            <w:tcW w:type="dxa" w:w="2494"/>
+          </w:tcPr>
+          <w:p>
+            <w:r/>
+            <w:r>
+              <w:rPr>
+                <w:sz w:val="16"/>
+              </w:rPr>
+              <w:t>unittest: subTest; pytest: @pytest.mark.parametrize</w:t>
+            </w:r>
+          </w:p>
+        </w:tc>
+        <w:tc>
+          <w:tcPr>
+            <w:tcW w:type="dxa" w:w="2608"/>
+          </w:tcPr>
+          <w:p>
+            <w:r/>
+            <w:r>
+              <w:rPr>
+                <w:sz w:val="16"/>
+              </w:rPr>
+              <w:t>Valores límite y particiones en una tabla de datos por caso</w:t>
+            </w:r>
+          </w:p>
+        </w:tc>
+      </w:tr>
+      <w:tr>
+        <w:tc>
+          <w:tcPr>
+            <w:tcW w:type="dxa" w:w="1928"/>
+          </w:tcPr>
+          <w:p>
+            <w:r/>
+            <w:r>
+              <w:rPr>
+                <w:sz w:val="16"/>
+              </w:rPr>
+              <w:t>Preparación de datos (setup)</w:t>
+            </w:r>
+          </w:p>
+        </w:tc>
+        <w:tc>
+          <w:tcPr>
+            <w:tcW w:type="dxa" w:w="2041"/>
+          </w:tcPr>
+          <w:p>
+            <w:r/>
+            <w:r>
+              <w:rPr>
+                <w:sz w:val="16"/>
+              </w:rPr>
+              <w:t>@Before / @BeforeMethod</w:t>
+            </w:r>
+          </w:p>
+        </w:tc>
+        <w:tc>
+          <w:tcPr>
+            <w:tcW w:type="dxa" w:w="2494"/>
+          </w:tcPr>
+          <w:p>
+            <w:r/>
+            <w:r>
+              <w:rPr>
+                <w:sz w:val="16"/>
+              </w:rPr>
+              <w:t>unittest: setUp; pytest: fixtures</w:t>
+            </w:r>
+          </w:p>
+        </w:tc>
+        <w:tc>
+          <w:tcPr>
+            <w:tcW w:type="dxa" w:w="2608"/>
+          </w:tcPr>
+          <w:p>
+            <w:r/>
+            <w:r>
+              <w:rPr>
+                <w:sz w:val="16"/>
+              </w:rPr>
+              <w:t>Fixtures: base en memoria, usuarios y stubs</w:t>
+            </w:r>
+          </w:p>
+        </w:tc>
+      </w:tr>
+      <w:tr>
+        <w:tc>
+          <w:tcPr>
+            <w:tcW w:type="dxa" w:w="1928"/>
+          </w:tcPr>
+          <w:p>
+            <w:r/>
+            <w:r>
+              <w:rPr>
+                <w:sz w:val="16"/>
+              </w:rPr>
+              <w:t>Stubs</w:t>
+            </w:r>
+          </w:p>
+        </w:tc>
+        <w:tc>
+          <w:tcPr>
+            <w:tcW w:type="dxa" w:w="2041"/>
+          </w:tcPr>
+          <w:p>
+            <w:r/>
+            <w:r>
+              <w:rPr>
+                <w:sz w:val="16"/>
+              </w:rPr>
+              <w:t>Mockito u objetos falsos</w:t>
+            </w:r>
+          </w:p>
+        </w:tc>
+        <w:tc>
+          <w:tcPr>
+            <w:tcW w:type="dxa" w:w="2494"/>
+          </w:tcPr>
+          <w:p>
+            <w:r/>
+            <w:r>
+              <w:rPr>
+                <w:sz w:val="16"/>
+              </w:rPr>
+              <w:t>unittest.mock; pytest: monkeypatch</w:t>
+            </w:r>
+          </w:p>
+        </w:tc>
+        <w:tc>
+          <w:tcPr>
+            <w:tcW w:type="dxa" w:w="2608"/>
+          </w:tcPr>
+          <w:p>
+            <w:r/>
+            <w:r>
+              <w:rPr>
+                <w:sz w:val="16"/>
+              </w:rPr>
+              <w:t>monkeypatch de db.session; SimpleNamespace como orden</w:t>
+            </w:r>
+          </w:p>
+        </w:tc>
+      </w:tr>
+      <w:tr>
+        <w:tc>
+          <w:tcPr>
+            <w:tcW w:type="dxa" w:w="1928"/>
+          </w:tcPr>
+          <w:p>
+            <w:r/>
+            <w:r>
+              <w:rPr>
+                <w:sz w:val="16"/>
+              </w:rPr>
+              <w:t>Grupos de pruebas</w:t>
+            </w:r>
+          </w:p>
+        </w:tc>
+        <w:tc>
+          <w:tcPr>
+            <w:tcW w:type="dxa" w:w="2041"/>
+          </w:tcPr>
+          <w:p>
+            <w:r/>
+            <w:r>
+              <w:rPr>
+                <w:sz w:val="16"/>
+              </w:rPr>
+              <w:t>TestNG: groups</w:t>
+            </w:r>
+          </w:p>
+        </w:tc>
+        <w:tc>
+          <w:tcPr>
+            <w:tcW w:type="dxa" w:w="2494"/>
+          </w:tcPr>
+          <w:p>
+            <w:r/>
+            <w:r>
+              <w:rPr>
+                <w:sz w:val="16"/>
+              </w:rPr>
+              <w:t>pytest: -k y marcadores</w:t>
+            </w:r>
+          </w:p>
+        </w:tc>
+        <w:tc>
+          <w:tcPr>
+            <w:tcW w:type="dxa" w:w="2608"/>
+          </w:tcPr>
+          <w:p>
+            <w:r/>
+            <w:r>
+              <w:rPr>
+                <w:sz w:val="16"/>
+              </w:rPr>
+              <w:t>pytest tests/test_unitarias.py ejecuta solo las unitarias</w:t>
+            </w:r>
+          </w:p>
+        </w:tc>
+      </w:tr>
+      <w:tr>
+        <w:tc>
+          <w:tcPr>
+            <w:tcW w:type="dxa" w:w="1928"/>
+          </w:tcPr>
+          <w:p>
+            <w:r/>
+            <w:r>
+              <w:rPr>
+                <w:sz w:val="16"/>
+              </w:rPr>
+              <w:t>Cobertura</w:t>
+            </w:r>
+          </w:p>
+        </w:tc>
+        <w:tc>
+          <w:tcPr>
+            <w:tcW w:type="dxa" w:w="2041"/>
+          </w:tcPr>
+          <w:p>
+            <w:r/>
+            <w:r>
+              <w:rPr>
+                <w:sz w:val="16"/>
+              </w:rPr>
+              <w:t>JaCoCo</w:t>
+            </w:r>
+          </w:p>
+        </w:tc>
+        <w:tc>
+          <w:tcPr>
+            <w:tcW w:type="dxa" w:w="2494"/>
+          </w:tcPr>
+          <w:p>
+            <w:r/>
+            <w:r>
+              <w:rPr>
+                <w:sz w:val="16"/>
+              </w:rPr>
+              <w:t>coverage.py / pytest-cov</w:t>
+            </w:r>
+          </w:p>
+        </w:tc>
+        <w:tc>
+          <w:tcPr>
+            <w:tcW w:type="dxa" w:w="2608"/>
+          </w:tcPr>
+          <w:p>
+            <w:r/>
+            <w:r>
+              <w:rPr>
+                <w:sz w:val="16"/>
+              </w:rPr>
+              <w:t>pytest --cov=app</w:t>
+            </w:r>
+          </w:p>
+        </w:tc>
+      </w:tr>
+    </w:tbl>
+    <w:p>
+      <w:pPr>
+        <w:pStyle w:val="Heading2"/>
+      </w:pPr>
+      <w:r>
+        <w:t>5.4 Ejemplos</w:t>
+      </w:r>
+    </w:p>
+    <w:p>
+      <w:r>
+        <w:t>La Figura 1 muestra una unidad (el método estado_stock de un insumo) y la Figura 2 su caso de prueba. Los datos se eligieron con valores límite: el stock en cero, por debajo de cero, justo en el mínimo y apenas por encima. Con @pytest.mark.parametrize, pytest ejecuta la misma prueba una vez por cada fila de datos.</w:t>
+      </w:r>
+    </w:p>
+    <w:tbl>
+      <w:tblPr>
+        <w:tblStyle w:val="TableGrid"/>
+        <w:tblW w:type="auto" w:w="0"/>
+        <w:tblLook w:firstColumn="1" w:firstRow="1" w:lastColumn="0" w:lastRow="0" w:noHBand="0" w:noVBand="1" w:val="04A0"/>
+      </w:tblPr>
+      <w:tblGrid>
+        <w:gridCol w:w="9760"/>
+      </w:tblGrid>
+      <w:tr>
+        <w:trPr>
+          <w:cantSplit/>
+        </w:trPr>
+        <w:tc>
+          <w:tcPr>
+            <w:tcW w:type="dxa" w:w="9760"/>
+            <w:shd w:val="clear" w:fill="F3F4F6"/>
+          </w:tcPr>
+          <w:p>
+            <w:r>
+              <w:rPr>
+                <w:rFonts w:ascii="Consolas" w:hAnsi="Consolas"/>
+                <w:color w:val="4B5563"/>
+                <w:sz w:val="16"/>
+              </w:rPr>
+              <w:t># backend/app/models/inventario.py  — unidad bajo prueba</w:t>
+              <w:br/>
+            </w:r>
+            <w:r>
+              <w:rPr>
+                <w:rFonts w:ascii="Consolas" w:hAnsi="Consolas"/>
+                <w:sz w:val="16"/>
+              </w:rPr>
+              <w:t>@property</w:t>
+              <w:br/>
+            </w:r>
+            <w:r>
+              <w:rPr>
+                <w:rFonts w:ascii="Consolas" w:hAnsi="Consolas"/>
+                <w:sz w:val="16"/>
+              </w:rPr>
+              <w:t>def estado_stock(self):</w:t>
+              <w:br/>
+            </w:r>
+            <w:r>
+              <w:rPr>
+                <w:rFonts w:ascii="Consolas" w:hAnsi="Consolas"/>
+                <w:color w:val="4B5563"/>
+                <w:sz w:val="16"/>
+              </w:rPr>
+              <w:t xml:space="preserve">    """RF-03.8 AGOTADO (sin stock), BAJO (en el mínimo o por debajo) u OK."""</w:t>
+              <w:br/>
+            </w:r>
+            <w:r>
+              <w:rPr>
+                <w:rFonts w:ascii="Consolas" w:hAnsi="Consolas"/>
+                <w:sz w:val="16"/>
+              </w:rPr>
+              <w:t xml:space="preserve">    if self.stock_actual &lt;= 0:</w:t>
+              <w:br/>
+            </w:r>
+            <w:r>
+              <w:rPr>
+                <w:rFonts w:ascii="Consolas" w:hAnsi="Consolas"/>
+                <w:sz w:val="16"/>
+              </w:rPr>
+              <w:t xml:space="preserve">        return "AGOTADO"</w:t>
+              <w:br/>
+            </w:r>
+            <w:r>
+              <w:rPr>
+                <w:rFonts w:ascii="Consolas" w:hAnsi="Consolas"/>
+                <w:sz w:val="16"/>
+              </w:rPr>
+              <w:t xml:space="preserve">    if self.stock_actual &lt;= self.stock_minimo:</w:t>
+              <w:br/>
+            </w:r>
+            <w:r>
+              <w:rPr>
+                <w:rFonts w:ascii="Consolas" w:hAnsi="Consolas"/>
+                <w:sz w:val="16"/>
+              </w:rPr>
+              <w:t xml:space="preserve">        return "BAJO"</w:t>
+              <w:br/>
+            </w:r>
+            <w:r>
+              <w:rPr>
+                <w:rFonts w:ascii="Consolas" w:hAnsi="Consolas"/>
+                <w:sz w:val="16"/>
+              </w:rPr>
+              <w:t xml:space="preserve">    return "OK"</w:t>
+            </w:r>
+          </w:p>
+        </w:tc>
+      </w:tr>
+    </w:tbl>
+    <w:p>
+      <w:pPr>
+        <w:jc w:val="center"/>
+      </w:pPr>
+      <w:r>
+        <w:rPr>
+          <w:i/>
+          <w:sz w:val="18"/>
+        </w:rPr>
+        <w:t>Figura 1 – Unidad bajo prueba (Python)</w:t>
+      </w:r>
+    </w:p>
+    <w:tbl>
+      <w:tblPr>
+        <w:tblStyle w:val="TableGrid"/>
+        <w:tblW w:type="auto" w:w="0"/>
+        <w:tblLook w:firstColumn="1" w:firstRow="1" w:lastColumn="0" w:lastRow="0" w:noHBand="0" w:noVBand="1" w:val="04A0"/>
+      </w:tblPr>
+      <w:tblGrid>
+        <w:gridCol w:w="9760"/>
+      </w:tblGrid>
+      <w:tr>
+        <w:trPr>
+          <w:cantSplit/>
+        </w:trPr>
+        <w:tc>
+          <w:tcPr>
+            <w:tcW w:type="dxa" w:w="9760"/>
+            <w:shd w:val="clear" w:fill="F3F4F6"/>
+          </w:tcPr>
+          <w:p>
+            <w:r>
+              <w:rPr>
+                <w:rFonts w:ascii="Consolas" w:hAnsi="Consolas"/>
+                <w:color w:val="4B5563"/>
+                <w:sz w:val="16"/>
+              </w:rPr>
+              <w:t># backend/tests/test_unitarias.py  — caso de prueba (pytest es el driver)</w:t>
+              <w:br/>
+            </w:r>
+            <w:r>
+              <w:rPr>
+                <w:rFonts w:ascii="Consolas" w:hAnsi="Consolas"/>
+                <w:sz w:val="16"/>
+              </w:rPr>
+              <w:t>@pytest.mark.parametrize("stock, minimo, esperado", [</w:t>
+              <w:br/>
+            </w:r>
+            <w:r>
+              <w:rPr>
+                <w:rFonts w:ascii="Consolas" w:hAnsi="Consolas"/>
+                <w:sz w:val="16"/>
+              </w:rPr>
+              <w:t xml:space="preserve">    (0, 5, "AGOTADO"),     # sin stock</w:t>
+              <w:br/>
+            </w:r>
+            <w:r>
+              <w:rPr>
+                <w:rFonts w:ascii="Consolas" w:hAnsi="Consolas"/>
+                <w:sz w:val="16"/>
+              </w:rPr>
+              <w:t xml:space="preserve">    (-1, 5, "AGOTADO"),    # valor límite por debajo de cero</w:t>
+              <w:br/>
+            </w:r>
+            <w:r>
+              <w:rPr>
+                <w:rFonts w:ascii="Consolas" w:hAnsi="Consolas"/>
+                <w:sz w:val="16"/>
+              </w:rPr>
+              <w:t xml:space="preserve">    (5, 5, "BAJO"),        # justo en el mínimo</w:t>
+              <w:br/>
+            </w:r>
+            <w:r>
+              <w:rPr>
+                <w:rFonts w:ascii="Consolas" w:hAnsi="Consolas"/>
+                <w:sz w:val="16"/>
+              </w:rPr>
+              <w:t xml:space="preserve">    (4.5, 5, "BAJO"),      # por debajo del mínimo</w:t>
+              <w:br/>
+            </w:r>
+            <w:r>
+              <w:rPr>
+                <w:rFonts w:ascii="Consolas" w:hAnsi="Consolas"/>
+                <w:sz w:val="16"/>
+              </w:rPr>
+              <w:t xml:space="preserve">    (5.001, 5, "OK"),      # apenas por encima del mínimo</w:t>
+              <w:br/>
+            </w:r>
+            <w:r>
+              <w:rPr>
+                <w:rFonts w:ascii="Consolas" w:hAnsi="Consolas"/>
+                <w:sz w:val="16"/>
+              </w:rPr>
+              <w:t xml:space="preserve">    (10, 0, "OK"),         # sin mínimo definido</w:t>
+              <w:br/>
+            </w:r>
+            <w:r>
+              <w:rPr>
+                <w:rFonts w:ascii="Consolas" w:hAnsi="Consolas"/>
+                <w:sz w:val="16"/>
+              </w:rPr>
+              <w:t>])</w:t>
+              <w:br/>
+            </w:r>
+            <w:r>
+              <w:rPr>
+                <w:rFonts w:ascii="Consolas" w:hAnsi="Consolas"/>
+                <w:sz w:val="16"/>
+              </w:rPr>
+              <w:t>def test_cpu_03_8_1_estado_stock(stock, minimo, esperado):</w:t>
+              <w:br/>
+            </w:r>
+            <w:r>
+              <w:rPr>
+                <w:rFonts w:ascii="Consolas" w:hAnsi="Consolas"/>
+                <w:color w:val="4B5563"/>
+                <w:sz w:val="16"/>
+              </w:rPr>
+              <w:t xml:space="preserve">    """CPU-03.8-1 | RF-03.8 | Clasifica AGOTADO / BAJO / OK en los valores límite."""</w:t>
+              <w:br/>
+            </w:r>
+            <w:r>
+              <w:rPr>
+                <w:rFonts w:ascii="Consolas" w:hAnsi="Consolas"/>
+                <w:sz w:val="16"/>
+              </w:rPr>
+              <w:t xml:space="preserve">    assert _insumo(stock, minimo).estado_stock == esperado</w:t>
+            </w:r>
+          </w:p>
+        </w:tc>
+      </w:tr>
+    </w:tbl>
+    <w:p>
+      <w:pPr>
+        <w:jc w:val="center"/>
+      </w:pPr>
+      <w:r>
+        <w:rPr>
+          <w:i/>
+          <w:sz w:val="18"/>
+        </w:rPr>
+        <w:t>Figura 2 – Caso de prueba con pytest y datos parametrizados</w:t>
+      </w:r>
+    </w:p>
+    <w:p>
+      <w:r>
+        <w:t>La Figura 3 prueba la regla «el inventario nunca queda negativo». La unidad registrar_movimiento guarda un movimiento en la base de datos; para probarla de forma aislada, la sesión de la base se reemplaza por un stub que solo anota lo que se le agrega. La prueba verifica que, ante una salida mayor al stock, la unidad lanza el error y no deja nada modificado.</w:t>
+      </w:r>
+    </w:p>
+    <w:tbl>
+      <w:tblPr>
+        <w:tblStyle w:val="TableGrid"/>
+        <w:tblW w:type="auto" w:w="0"/>
+        <w:tblLook w:firstColumn="1" w:firstRow="1" w:lastColumn="0" w:lastRow="0" w:noHBand="0" w:noVBand="1" w:val="04A0"/>
+      </w:tblPr>
+      <w:tblGrid>
+        <w:gridCol w:w="9760"/>
+      </w:tblGrid>
+      <w:tr>
+        <w:trPr>
+          <w:cantSplit/>
+        </w:trPr>
+        <w:tc>
+          <w:tcPr>
+            <w:tcW w:type="dxa" w:w="9760"/>
+            <w:shd w:val="clear" w:fill="F3F4F6"/>
+          </w:tcPr>
+          <w:p>
+            <w:r>
+              <w:rPr>
+                <w:rFonts w:ascii="Consolas" w:hAnsi="Consolas"/>
+                <w:sz w:val="16"/>
+              </w:rPr>
+              <w:t>@pytest.fixture()</w:t>
+              <w:br/>
+            </w:r>
+            <w:r>
+              <w:rPr>
+                <w:rFonts w:ascii="Consolas" w:hAnsi="Consolas"/>
+                <w:sz w:val="16"/>
+              </w:rPr>
+              <w:t>def sesion_falsa(monkeypatch):</w:t>
+              <w:br/>
+            </w:r>
+            <w:r>
+              <w:rPr>
+                <w:rFonts w:ascii="Consolas" w:hAnsi="Consolas"/>
+                <w:color w:val="4B5563"/>
+                <w:sz w:val="16"/>
+              </w:rPr>
+              <w:t xml:space="preserve">    """Stub de db.session: guarda lo que se le agrega en una lista, sin tocar la base."""</w:t>
+              <w:br/>
+            </w:r>
+            <w:r>
+              <w:rPr>
+                <w:rFonts w:ascii="Consolas" w:hAnsi="Consolas"/>
+                <w:sz w:val="16"/>
+              </w:rPr>
+              <w:t xml:space="preserve">    agregados = []</w:t>
+              <w:br/>
+            </w:r>
+            <w:r>
+              <w:rPr>
+                <w:rFonts w:ascii="Consolas" w:hAnsi="Consolas"/>
+                <w:sz w:val="16"/>
+              </w:rPr>
+              <w:t xml:space="preserve">    monkeypatch.setattr(servicio_inventario.db, "session", SimpleNamespace(add=agregados.append))</w:t>
+              <w:br/>
+            </w:r>
+            <w:r>
+              <w:rPr>
+                <w:rFonts w:ascii="Consolas" w:hAnsi="Consolas"/>
+                <w:sz w:val="16"/>
+              </w:rPr>
+              <w:t xml:space="preserve">    return agregados</w:t>
+              <w:br/>
+            </w:r>
+            <w:r>
+              <w:rPr>
+                <w:rFonts w:ascii="Consolas" w:hAnsi="Consolas"/>
+                <w:sz w:val="16"/>
+              </w:rPr>
+              <w:br/>
+            </w:r>
+            <w:r>
+              <w:rPr>
+                <w:rFonts w:ascii="Consolas" w:hAnsi="Consolas"/>
+                <w:sz w:val="16"/>
+              </w:rPr>
+              <w:br/>
+            </w:r>
+            <w:r>
+              <w:rPr>
+                <w:rFonts w:ascii="Consolas" w:hAnsi="Consolas"/>
+                <w:sz w:val="16"/>
+              </w:rPr>
+              <w:t>def test_cpu_03_5_2_salida_sin_stock(sesion_falsa):</w:t>
+              <w:br/>
+            </w:r>
+            <w:r>
+              <w:rPr>
+                <w:rFonts w:ascii="Consolas" w:hAnsi="Consolas"/>
+                <w:color w:val="4B5563"/>
+                <w:sz w:val="16"/>
+              </w:rPr>
+              <w:t xml:space="preserve">    """CPU-03.5-2 | RF-03.5 | Una SALIDA mayor al stock lanza StockInsuficiente y no cambia nada."""</w:t>
+              <w:br/>
+            </w:r>
+            <w:r>
+              <w:rPr>
+                <w:rFonts w:ascii="Consolas" w:hAnsi="Consolas"/>
+                <w:sz w:val="16"/>
+              </w:rPr>
+              <w:t xml:space="preserve">    arroz = _insumo(3)</w:t>
+              <w:br/>
+            </w:r>
+            <w:r>
+              <w:rPr>
+                <w:rFonts w:ascii="Consolas" w:hAnsi="Consolas"/>
+                <w:sz w:val="16"/>
+              </w:rPr>
+              <w:t xml:space="preserve">    with pytest.raises(StockInsuficiente, match="hay 3 KG y se necesitan 3.5"):</w:t>
+              <w:br/>
+            </w:r>
+            <w:r>
+              <w:rPr>
+                <w:rFonts w:ascii="Consolas" w:hAnsi="Consolas"/>
+                <w:sz w:val="16"/>
+              </w:rPr>
+              <w:t xml:space="preserve">        registrar_movimiento(arroz, "SALIDA", "CONSUMO", 3.5, usuario_id=1)</w:t>
+              <w:br/>
+            </w:r>
+            <w:r>
+              <w:rPr>
+                <w:rFonts w:ascii="Consolas" w:hAnsi="Consolas"/>
+                <w:sz w:val="16"/>
+              </w:rPr>
+              <w:t xml:space="preserve">    assert arroz.stock_actual == 3        # la unidad no modificó el insumo</w:t>
+              <w:br/>
+            </w:r>
+            <w:r>
+              <w:rPr>
+                <w:rFonts w:ascii="Consolas" w:hAnsi="Consolas"/>
+                <w:sz w:val="16"/>
+              </w:rPr>
+              <w:t xml:space="preserve">    assert sesion_falsa == []             # ni dejó un movimiento a medias</w:t>
+            </w:r>
+          </w:p>
+        </w:tc>
+      </w:tr>
+    </w:tbl>
+    <w:p>
+      <w:pPr>
+        <w:jc w:val="center"/>
+      </w:pPr>
+      <w:r>
+        <w:rPr>
+          <w:i/>
+          <w:sz w:val="18"/>
+        </w:rPr>
+        <w:t>Figura 3 – Caso de prueba con un stub de la base de datos</w:t>
+      </w:r>
+    </w:p>
+    <w:tbl>
+      <w:tblPr>
+        <w:tblStyle w:val="TableGrid"/>
+        <w:tblW w:type="auto" w:w="0"/>
+        <w:tblLook w:firstColumn="1" w:firstRow="1" w:lastColumn="0" w:lastRow="0" w:noHBand="0" w:noVBand="1" w:val="04A0"/>
+      </w:tblPr>
+      <w:tblGrid>
+        <w:gridCol w:w="9760"/>
+      </w:tblGrid>
+      <w:tr>
+        <w:trPr>
+          <w:cantSplit/>
+        </w:trPr>
+        <w:tc>
+          <w:tcPr>
+            <w:tcW w:type="dxa" w:w="9760"/>
+            <w:shd w:val="clear" w:fill="F3F4F6"/>
+          </w:tcPr>
+          <w:p>
+            <w:r>
+              <w:rPr>
+                <w:rFonts w:ascii="Consolas" w:hAnsi="Consolas"/>
+                <w:sz w:val="16"/>
+              </w:rPr>
+              <w:t>&gt; pytest tests/test_unitarias.py -v</w:t>
+              <w:br/>
+            </w:r>
+            <w:r>
+              <w:rPr>
+                <w:rFonts w:ascii="Consolas" w:hAnsi="Consolas"/>
+                <w:sz w:val="16"/>
+              </w:rPr>
+              <w:t>tests/test_unitarias.py::test_cpu_03_8_1_estado_stock[0-5-AGOTADO] PASSED</w:t>
+              <w:br/>
+            </w:r>
+            <w:r>
+              <w:rPr>
+                <w:rFonts w:ascii="Consolas" w:hAnsi="Consolas"/>
+                <w:sz w:val="16"/>
+              </w:rPr>
+              <w:t>tests/test_unitarias.py::test_cpu_03_8_1_estado_stock[-1-5-AGOTADO] PASSED</w:t>
+              <w:br/>
+            </w:r>
+            <w:r>
+              <w:rPr>
+                <w:rFonts w:ascii="Consolas" w:hAnsi="Consolas"/>
+                <w:sz w:val="16"/>
+              </w:rPr>
+              <w:t>tests/test_unitarias.py::test_cpu_03_8_1_estado_stock[5-5-BAJO] PASSED</w:t>
+              <w:br/>
+            </w:r>
+            <w:r>
+              <w:rPr>
+                <w:rFonts w:ascii="Consolas" w:hAnsi="Consolas"/>
+                <w:sz w:val="16"/>
+              </w:rPr>
+              <w:t>...</w:t>
+              <w:br/>
+            </w:r>
+            <w:r>
+              <w:rPr>
+                <w:rFonts w:ascii="Consolas" w:hAnsi="Consolas"/>
+                <w:sz w:val="16"/>
+              </w:rPr>
+              <w:t>tests/test_unitarias.py::test_cpu_11_1_2_fecha_invalida[ayer] PASSED</w:t>
+              <w:br/>
+            </w:r>
+            <w:r>
+              <w:rPr>
+                <w:rFonts w:ascii="Consolas" w:hAnsi="Consolas"/>
+                <w:sz w:val="16"/>
+              </w:rPr>
+              <w:t>============================= 41 passed in 0.48s ==============================</w:t>
+            </w:r>
+          </w:p>
+        </w:tc>
+      </w:tr>
+    </w:tbl>
+    <w:p>
+      <w:pPr>
+        <w:jc w:val="center"/>
+      </w:pPr>
+      <w:r>
+        <w:rPr>
+          <w:i/>
+          <w:sz w:val="18"/>
+        </w:rPr>
+        <w:t>Figura 4 – Ejecución de la suite unitaria</w:t>
+      </w:r>
+    </w:p>
+    <w:p>
+      <w:pPr>
+        <w:pStyle w:val="Heading2"/>
+      </w:pPr>
+      <w:r>
+        <w:t>5.5 Resultados por unidad</w:t>
+      </w:r>
+    </w:p>
+    <w:tbl>
+      <w:tblPr>
+        <w:tblStyle w:val="TableGrid"/>
+        <w:tblW w:type="auto" w:w="0"/>
+        <w:tblLook w:firstColumn="1" w:firstRow="1" w:lastColumn="0" w:lastRow="0" w:noHBand="0" w:noVBand="1" w:val="04A0"/>
+      </w:tblPr>
+      <w:tblGrid>
+        <w:gridCol w:w="1952"/>
+        <w:gridCol w:w="1952"/>
+        <w:gridCol w:w="1952"/>
+        <w:gridCol w:w="1952"/>
+        <w:gridCol w:w="1952"/>
+      </w:tblGrid>
+      <w:tr>
+        <w:tc>
+          <w:tcPr>
+            <w:tcW w:type="dxa" w:w="2381"/>
+            <w:shd w:val="clear" w:color="auto" w:fill="F5DED5"/>
+          </w:tcPr>
+          <w:p>
+            <w:r/>
+            <w:r>
+              <w:rPr>
+                <w:b/>
+                <w:sz w:val="16"/>
+              </w:rPr>
+              <w:t>Unidad bajo prueba</w:t>
+            </w:r>
+          </w:p>
+        </w:tc>
+        <w:tc>
+          <w:tcPr>
+            <w:tcW w:type="dxa" w:w="1247"/>
+            <w:shd w:val="clear" w:color="auto" w:fill="F5DED5"/>
+          </w:tcPr>
+          <w:p>
+            <w:r/>
+            <w:r>
+              <w:rPr>
+                <w:b/>
+                <w:sz w:val="16"/>
+              </w:rPr>
+              <w:t>Requisito</w:t>
+            </w:r>
+          </w:p>
+        </w:tc>
+        <w:tc>
+          <w:tcPr>
+            <w:tcW w:type="dxa" w:w="3175"/>
+            <w:shd w:val="clear" w:color="auto" w:fill="F5DED5"/>
+          </w:tcPr>
+          <w:p>
+            <w:r/>
+            <w:r>
+              <w:rPr>
+                <w:b/>
+                <w:sz w:val="16"/>
+              </w:rPr>
+              <w:t>Técnica de diseño de los datos</w:t>
+            </w:r>
+          </w:p>
+        </w:tc>
+        <w:tc>
+          <w:tcPr>
+            <w:tcW w:type="dxa" w:w="1020"/>
+            <w:shd w:val="clear" w:color="auto" w:fill="F5DED5"/>
+          </w:tcPr>
+          <w:p>
+            <w:r/>
+            <w:r>
+              <w:rPr>
+                <w:b/>
+                <w:sz w:val="16"/>
+              </w:rPr>
+              <w:t>Casos / ejec.</w:t>
+            </w:r>
+          </w:p>
+        </w:tc>
+        <w:tc>
+          <w:tcPr>
+            <w:tcW w:type="dxa" w:w="1247"/>
+            <w:shd w:val="clear" w:color="auto" w:fill="F5DED5"/>
+          </w:tcPr>
+          <w:p>
+            <w:r/>
+            <w:r>
+              <w:rPr>
+                <w:b/>
+                <w:sz w:val="16"/>
+              </w:rPr>
+              <w:t>Resultado</w:t>
+            </w:r>
+          </w:p>
+        </w:tc>
+      </w:tr>
+      <w:tr>
+        <w:tc>
+          <w:tcPr>
+            <w:tcW w:type="dxa" w:w="2381"/>
+          </w:tcPr>
+          <w:p>
+            <w:r/>
+            <w:r>
+              <w:rPr>
+                <w:sz w:val="16"/>
+              </w:rPr>
+              <w:t>Insumo.estado_stock</w:t>
+            </w:r>
+          </w:p>
+        </w:tc>
+        <w:tc>
+          <w:tcPr>
+            <w:tcW w:type="dxa" w:w="1247"/>
+          </w:tcPr>
+          <w:p>
+            <w:r/>
+            <w:r>
+              <w:rPr>
+                <w:sz w:val="16"/>
+              </w:rPr>
+              <w:t>RF-03.8</w:t>
+            </w:r>
+          </w:p>
+        </w:tc>
+        <w:tc>
+          <w:tcPr>
+            <w:tcW w:type="dxa" w:w="3175"/>
+          </w:tcPr>
+          <w:p>
+            <w:r/>
+            <w:r>
+              <w:rPr>
+                <w:sz w:val="16"/>
+              </w:rPr>
+              <w:t>Caja negra: valores límite (0, mínimo, mínimo + 0,001)</w:t>
+            </w:r>
+          </w:p>
+        </w:tc>
+        <w:tc>
+          <w:tcPr>
+            <w:tcW w:type="dxa" w:w="1020"/>
+          </w:tcPr>
+          <w:p>
+            <w:r/>
+            <w:r>
+              <w:rPr>
+                <w:sz w:val="16"/>
+              </w:rPr>
+              <w:t>1 / 6</w:t>
+            </w:r>
+          </w:p>
+        </w:tc>
+        <w:tc>
+          <w:tcPr>
+            <w:tcW w:type="dxa" w:w="1247"/>
+          </w:tcPr>
+          <w:p>
+            <w:r/>
+            <w:r>
+              <w:rPr>
+                <w:sz w:val="16"/>
+              </w:rPr>
+              <w:t>Aprobada</w:t>
+            </w:r>
+          </w:p>
+        </w:tc>
+      </w:tr>
+      <w:tr>
+        <w:tc>
+          <w:tcPr>
+            <w:tcW w:type="dxa" w:w="2381"/>
+          </w:tcPr>
+          <w:p>
+            <w:r/>
+            <w:r>
+              <w:rPr>
+                <w:sz w:val="16"/>
+              </w:rPr>
+              <w:t>registrar_movimiento (ENTRADA)</w:t>
+            </w:r>
+          </w:p>
+        </w:tc>
+        <w:tc>
+          <w:tcPr>
+            <w:tcW w:type="dxa" w:w="1247"/>
+          </w:tcPr>
+          <w:p>
+            <w:r/>
+            <w:r>
+              <w:rPr>
+                <w:sz w:val="16"/>
+              </w:rPr>
+              <w:t>RF-03.4</w:t>
+            </w:r>
+          </w:p>
+        </w:tc>
+        <w:tc>
+          <w:tcPr>
+            <w:tcW w:type="dxa" w:w="3175"/>
+          </w:tcPr>
+          <w:p>
+            <w:r/>
+            <w:r>
+              <w:rPr>
+                <w:sz w:val="16"/>
+              </w:rPr>
+              <w:t>Caja negra + stub de la sesión de base de datos</w:t>
+            </w:r>
+          </w:p>
+        </w:tc>
+        <w:tc>
+          <w:tcPr>
+            <w:tcW w:type="dxa" w:w="1020"/>
+          </w:tcPr>
+          <w:p>
+            <w:r/>
+            <w:r>
+              <w:rPr>
+                <w:sz w:val="16"/>
+              </w:rPr>
+              <w:t>1 / 1</w:t>
+            </w:r>
+          </w:p>
+        </w:tc>
+        <w:tc>
+          <w:tcPr>
+            <w:tcW w:type="dxa" w:w="1247"/>
+          </w:tcPr>
+          <w:p>
+            <w:r/>
+            <w:r>
+              <w:rPr>
+                <w:sz w:val="16"/>
+              </w:rPr>
+              <w:t>Aprobada</w:t>
+            </w:r>
+          </w:p>
+        </w:tc>
+      </w:tr>
+      <w:tr>
+        <w:tc>
+          <w:tcPr>
+            <w:tcW w:type="dxa" w:w="2381"/>
+          </w:tcPr>
+          <w:p>
+            <w:r/>
+            <w:r>
+              <w:rPr>
+                <w:sz w:val="16"/>
+              </w:rPr>
+              <w:t>registrar_movimiento (SALIDA) y numero()</w:t>
+            </w:r>
+          </w:p>
+        </w:tc>
+        <w:tc>
+          <w:tcPr>
+            <w:tcW w:type="dxa" w:w="1247"/>
+          </w:tcPr>
+          <w:p>
+            <w:r/>
+            <w:r>
+              <w:rPr>
+                <w:sz w:val="16"/>
+              </w:rPr>
+              <w:t>RF-03.5</w:t>
+            </w:r>
+          </w:p>
+        </w:tc>
+        <w:tc>
+          <w:tcPr>
+            <w:tcW w:type="dxa" w:w="3175"/>
+          </w:tcPr>
+          <w:p>
+            <w:r/>
+            <w:r>
+              <w:rPr>
+                <w:sz w:val="16"/>
+              </w:rPr>
+              <w:t>Valores límite (stock exacto, stock − 0,5) + stub</w:t>
+            </w:r>
+          </w:p>
+        </w:tc>
+        <w:tc>
+          <w:tcPr>
+            <w:tcW w:type="dxa" w:w="1020"/>
+          </w:tcPr>
+          <w:p>
+            <w:r/>
+            <w:r>
+              <w:rPr>
+                <w:sz w:val="16"/>
+              </w:rPr>
+              <w:t>4 / 6</w:t>
+            </w:r>
+          </w:p>
+        </w:tc>
+        <w:tc>
+          <w:tcPr>
+            <w:tcW w:type="dxa" w:w="1247"/>
+          </w:tcPr>
+          <w:p>
+            <w:r/>
+            <w:r>
+              <w:rPr>
+                <w:sz w:val="16"/>
+              </w:rPr>
+              <w:t>Aprobada</w:t>
+            </w:r>
+          </w:p>
+        </w:tc>
+      </w:tr>
+      <w:tr>
+        <w:tc>
+          <w:tcPr>
+            <w:tcW w:type="dxa" w:w="2381"/>
+          </w:tcPr>
+          <w:p>
+            <w:r/>
+            <w:r>
+              <w:rPr>
+                <w:sz w:val="16"/>
+              </w:rPr>
+              <w:t>Producto.costo y Producto.porciones_posibles</w:t>
+            </w:r>
+          </w:p>
+        </w:tc>
+        <w:tc>
+          <w:tcPr>
+            <w:tcW w:type="dxa" w:w="1247"/>
+          </w:tcPr>
+          <w:p>
+            <w:r/>
+            <w:r>
+              <w:rPr>
+                <w:sz w:val="16"/>
+              </w:rPr>
+              <w:t>RF-04.4</w:t>
+            </w:r>
+          </w:p>
+        </w:tc>
+        <w:tc>
+          <w:tcPr>
+            <w:tcW w:type="dxa" w:w="3175"/>
+          </w:tcPr>
+          <w:p>
+            <w:r/>
+            <w:r>
+              <w:rPr>
+                <w:sz w:val="16"/>
+              </w:rPr>
+              <w:t>Particiones: qué insumo limita; sin receta</w:t>
+            </w:r>
+          </w:p>
+        </w:tc>
+        <w:tc>
+          <w:tcPr>
+            <w:tcW w:type="dxa" w:w="1020"/>
+          </w:tcPr>
+          <w:p>
+            <w:r/>
+            <w:r>
+              <w:rPr>
+                <w:sz w:val="16"/>
+              </w:rPr>
+              <w:t>3 / 5</w:t>
+            </w:r>
+          </w:p>
+        </w:tc>
+        <w:tc>
+          <w:tcPr>
+            <w:tcW w:type="dxa" w:w="1247"/>
+          </w:tcPr>
+          <w:p>
+            <w:r/>
+            <w:r>
+              <w:rPr>
+                <w:sz w:val="16"/>
+              </w:rPr>
+              <w:t>Aprobada</w:t>
+            </w:r>
+          </w:p>
+        </w:tc>
+      </w:tr>
+      <w:tr>
+        <w:tc>
+          <w:tcPr>
+            <w:tcW w:type="dxa" w:w="2381"/>
+          </w:tcPr>
+          <w:p>
+            <w:r/>
+            <w:r>
+              <w:rPr>
+                <w:sz w:val="16"/>
+              </w:rPr>
+              <w:t>estado_pago y pagado</w:t>
+            </w:r>
+          </w:p>
+        </w:tc>
+        <w:tc>
+          <w:tcPr>
+            <w:tcW w:type="dxa" w:w="1247"/>
+          </w:tcPr>
+          <w:p>
+            <w:r/>
+            <w:r>
+              <w:rPr>
+                <w:sz w:val="16"/>
+              </w:rPr>
+              <w:t>RF-09.4</w:t>
+            </w:r>
+          </w:p>
+        </w:tc>
+        <w:tc>
+          <w:tcPr>
+            <w:tcW w:type="dxa" w:w="3175"/>
+          </w:tcPr>
+          <w:p>
+            <w:r/>
+            <w:r>
+              <w:rPr>
+                <w:sz w:val="16"/>
+              </w:rPr>
+              <w:t>Particiones: sin pago, parcial, total, anulado, de más + stub de la orden</w:t>
+            </w:r>
+          </w:p>
+        </w:tc>
+        <w:tc>
+          <w:tcPr>
+            <w:tcW w:type="dxa" w:w="1020"/>
+          </w:tcPr>
+          <w:p>
+            <w:r/>
+            <w:r>
+              <w:rPr>
+                <w:sz w:val="16"/>
+              </w:rPr>
+              <w:t>2 / 6</w:t>
+            </w:r>
+          </w:p>
+        </w:tc>
+        <w:tc>
+          <w:tcPr>
+            <w:tcW w:type="dxa" w:w="1247"/>
+          </w:tcPr>
+          <w:p>
+            <w:r/>
+            <w:r>
+              <w:rPr>
+                <w:sz w:val="16"/>
+              </w:rPr>
+              <w:t>Aprobada</w:t>
+            </w:r>
+          </w:p>
+        </w:tc>
+      </w:tr>
+      <w:tr>
+        <w:tc>
+          <w:tcPr>
+            <w:tcW w:type="dxa" w:w="2381"/>
+          </w:tcPr>
+          <w:p>
+            <w:r/>
+            <w:r>
+              <w:rPr>
+                <w:sz w:val="16"/>
+              </w:rPr>
+              <w:t>registrar_pago (validaciones)</w:t>
+            </w:r>
+          </w:p>
+        </w:tc>
+        <w:tc>
+          <w:tcPr>
+            <w:tcW w:type="dxa" w:w="1247"/>
+          </w:tcPr>
+          <w:p>
+            <w:r/>
+            <w:r>
+              <w:rPr>
+                <w:sz w:val="16"/>
+              </w:rPr>
+              <w:t>RF-09.1, RF-09.2</w:t>
+            </w:r>
+          </w:p>
+        </w:tc>
+        <w:tc>
+          <w:tcPr>
+            <w:tcW w:type="dxa" w:w="3175"/>
+          </w:tcPr>
+          <w:p>
+            <w:r/>
+            <w:r>
+              <w:rPr>
+                <w:sz w:val="16"/>
+              </w:rPr>
+              <w:t>Caja negra: una partición inválida por regla + stub</w:t>
+            </w:r>
+          </w:p>
+        </w:tc>
+        <w:tc>
+          <w:tcPr>
+            <w:tcW w:type="dxa" w:w="1020"/>
+          </w:tcPr>
+          <w:p>
+            <w:r/>
+            <w:r>
+              <w:rPr>
+                <w:sz w:val="16"/>
+              </w:rPr>
+              <w:t>1 / 4</w:t>
+            </w:r>
+          </w:p>
+        </w:tc>
+        <w:tc>
+          <w:tcPr>
+            <w:tcW w:type="dxa" w:w="1247"/>
+          </w:tcPr>
+          <w:p>
+            <w:r/>
+            <w:r>
+              <w:rPr>
+                <w:sz w:val="16"/>
+              </w:rPr>
+              <w:t>Aprobada</w:t>
+            </w:r>
+          </w:p>
+        </w:tc>
+      </w:tr>
+      <w:tr>
+        <w:tc>
+          <w:tcPr>
+            <w:tcW w:type="dxa" w:w="2381"/>
+          </w:tcPr>
+          <w:p>
+            <w:r/>
+            <w:r>
+              <w:rPr>
+                <w:sz w:val="16"/>
+              </w:rPr>
+              <w:t>Pago.METODOS</w:t>
+            </w:r>
+          </w:p>
+        </w:tc>
+        <w:tc>
+          <w:tcPr>
+            <w:tcW w:type="dxa" w:w="1247"/>
+          </w:tcPr>
+          <w:p>
+            <w:r/>
+            <w:r>
+              <w:rPr>
+                <w:sz w:val="16"/>
+              </w:rPr>
+              <w:t>RF-09.2</w:t>
+            </w:r>
+          </w:p>
+        </w:tc>
+        <w:tc>
+          <w:tcPr>
+            <w:tcW w:type="dxa" w:w="3175"/>
+          </w:tcPr>
+          <w:p>
+            <w:r/>
+            <w:r>
+              <w:rPr>
+                <w:sz w:val="16"/>
+              </w:rPr>
+              <w:t>Verificación de la especificación</w:t>
+            </w:r>
+          </w:p>
+        </w:tc>
+        <w:tc>
+          <w:tcPr>
+            <w:tcW w:type="dxa" w:w="1020"/>
+          </w:tcPr>
+          <w:p>
+            <w:r/>
+            <w:r>
+              <w:rPr>
+                <w:sz w:val="16"/>
+              </w:rPr>
+              <w:t>1 / 1</w:t>
+            </w:r>
+          </w:p>
+        </w:tc>
+        <w:tc>
+          <w:tcPr>
+            <w:tcW w:type="dxa" w:w="1247"/>
+          </w:tcPr>
+          <w:p>
+            <w:r/>
+            <w:r>
+              <w:rPr>
+                <w:sz w:val="16"/>
+              </w:rPr>
+              <w:t>Aprobada</w:t>
+            </w:r>
+          </w:p>
+        </w:tc>
+      </w:tr>
+      <w:tr>
+        <w:tc>
+          <w:tcPr>
+            <w:tcW w:type="dxa" w:w="2381"/>
+          </w:tcPr>
+          <w:p>
+            <w:r/>
+            <w:r>
+              <w:rPr>
+                <w:sz w:val="16"/>
+              </w:rPr>
+              <w:t>Máquinas de estado de compras y domicilios</w:t>
+            </w:r>
+          </w:p>
+        </w:tc>
+        <w:tc>
+          <w:tcPr>
+            <w:tcW w:type="dxa" w:w="1247"/>
+          </w:tcPr>
+          <w:p>
+            <w:r/>
+            <w:r>
+              <w:rPr>
+                <w:sz w:val="16"/>
+              </w:rPr>
+              <w:t>RF-02.7, RF-08.6</w:t>
+            </w:r>
+          </w:p>
+        </w:tc>
+        <w:tc>
+          <w:tcPr>
+            <w:tcW w:type="dxa" w:w="3175"/>
+          </w:tcPr>
+          <w:p>
+            <w:r/>
+            <w:r>
+              <w:rPr>
+                <w:sz w:val="16"/>
+              </w:rPr>
+              <w:t>Caja blanca: recorrido de todas las transiciones</w:t>
+            </w:r>
+          </w:p>
+        </w:tc>
+        <w:tc>
+          <w:tcPr>
+            <w:tcW w:type="dxa" w:w="1020"/>
+          </w:tcPr>
+          <w:p>
+            <w:r/>
+            <w:r>
+              <w:rPr>
+                <w:sz w:val="16"/>
+              </w:rPr>
+              <w:t>2 / 3</w:t>
+            </w:r>
+          </w:p>
+        </w:tc>
+        <w:tc>
+          <w:tcPr>
+            <w:tcW w:type="dxa" w:w="1247"/>
+          </w:tcPr>
+          <w:p>
+            <w:r/>
+            <w:r>
+              <w:rPr>
+                <w:sz w:val="16"/>
+              </w:rPr>
+              <w:t>Aprobada</w:t>
+            </w:r>
+          </w:p>
+        </w:tc>
+      </w:tr>
+      <w:tr>
+        <w:tc>
+          <w:tcPr>
+            <w:tcW w:type="dxa" w:w="2381"/>
+          </w:tcPr>
+          <w:p>
+            <w:r/>
+            <w:r>
+              <w:rPr>
+                <w:sz w:val="16"/>
+              </w:rPr>
+              <w:t>Usuario.set_password / check_password</w:t>
+            </w:r>
+          </w:p>
+        </w:tc>
+        <w:tc>
+          <w:tcPr>
+            <w:tcW w:type="dxa" w:w="1247"/>
+          </w:tcPr>
+          <w:p>
+            <w:r/>
+            <w:r>
+              <w:rPr>
+                <w:sz w:val="16"/>
+              </w:rPr>
+              <w:t>RF-01.1, RF-01.4</w:t>
+            </w:r>
+          </w:p>
+        </w:tc>
+        <w:tc>
+          <w:tcPr>
+            <w:tcW w:type="dxa" w:w="3175"/>
+          </w:tcPr>
+          <w:p>
+            <w:r/>
+            <w:r>
+              <w:rPr>
+                <w:sz w:val="16"/>
+              </w:rPr>
+              <w:t>Caja negra: clave correcta, distinta, misma clave dos veces</w:t>
+            </w:r>
+          </w:p>
+        </w:tc>
+        <w:tc>
+          <w:tcPr>
+            <w:tcW w:type="dxa" w:w="1020"/>
+          </w:tcPr>
+          <w:p>
+            <w:r/>
+            <w:r>
+              <w:rPr>
+                <w:sz w:val="16"/>
+              </w:rPr>
+              <w:t>2 / 2</w:t>
+            </w:r>
+          </w:p>
+        </w:tc>
+        <w:tc>
+          <w:tcPr>
+            <w:tcW w:type="dxa" w:w="1247"/>
+          </w:tcPr>
+          <w:p>
+            <w:r/>
+            <w:r>
+              <w:rPr>
+                <w:sz w:val="16"/>
+              </w:rPr>
+              <w:t>Aprobada</w:t>
+            </w:r>
+          </w:p>
+        </w:tc>
+      </w:tr>
+      <w:tr>
+        <w:tc>
+          <w:tcPr>
+            <w:tcW w:type="dxa" w:w="2381"/>
+          </w:tcPr>
+          <w:p>
+            <w:r/>
+            <w:r>
+              <w:rPr>
+                <w:sz w:val="16"/>
+              </w:rPr>
+              <w:t>filtrar_por_fechas</w:t>
+            </w:r>
+          </w:p>
+        </w:tc>
+        <w:tc>
+          <w:tcPr>
+            <w:tcW w:type="dxa" w:w="1247"/>
+          </w:tcPr>
+          <w:p>
+            <w:r/>
+            <w:r>
+              <w:rPr>
+                <w:sz w:val="16"/>
+              </w:rPr>
+              <w:t>RF-10.4, RF-11.2</w:t>
+            </w:r>
+          </w:p>
+        </w:tc>
+        <w:tc>
+          <w:tcPr>
+            <w:tcW w:type="dxa" w:w="3175"/>
+          </w:tcPr>
+          <w:p>
+            <w:r/>
+            <w:r>
+              <w:rPr>
+                <w:sz w:val="16"/>
+              </w:rPr>
+              <w:t>Particiones de los parámetros + stubs de consulta y columna SQL</w:t>
+            </w:r>
+          </w:p>
+        </w:tc>
+        <w:tc>
+          <w:tcPr>
+            <w:tcW w:type="dxa" w:w="1020"/>
+          </w:tcPr>
+          <w:p>
+            <w:r/>
+            <w:r>
+              <w:rPr>
+                <w:sz w:val="16"/>
+              </w:rPr>
+              <w:t>2 / 7</w:t>
+            </w:r>
+          </w:p>
+        </w:tc>
+        <w:tc>
+          <w:tcPr>
+            <w:tcW w:type="dxa" w:w="1247"/>
+          </w:tcPr>
+          <w:p>
+            <w:r/>
+            <w:r>
+              <w:rPr>
+                <w:sz w:val="16"/>
+              </w:rPr>
+              <w:t>Aprobada</w:t>
+            </w:r>
+          </w:p>
+        </w:tc>
+      </w:tr>
+      <w:tr>
+        <w:tc>
+          <w:tcPr>
+            <w:tcW w:type="dxa" w:w="2381"/>
+          </w:tcPr>
+          <w:p>
+            <w:r/>
+            <w:r>
+              <w:rPr>
+                <w:sz w:val="16"/>
+              </w:rPr>
+              <w:t>TOTAL</w:t>
+            </w:r>
+          </w:p>
+        </w:tc>
+        <w:tc>
+          <w:tcPr>
+            <w:tcW w:type="dxa" w:w="1247"/>
+          </w:tcPr>
+          <w:p>
+            <w:r/>
+            <w:r>
+              <w:rPr>
+                <w:sz w:val="16"/>
+              </w:rPr>
+            </w:r>
+          </w:p>
+        </w:tc>
+        <w:tc>
+          <w:tcPr>
+            <w:tcW w:type="dxa" w:w="3175"/>
+          </w:tcPr>
+          <w:p>
+            <w:r/>
+            <w:r>
+              <w:rPr>
+                <w:sz w:val="16"/>
+              </w:rPr>
+            </w:r>
+          </w:p>
+        </w:tc>
+        <w:tc>
+          <w:tcPr>
+            <w:tcW w:type="dxa" w:w="1020"/>
+          </w:tcPr>
+          <w:p>
+            <w:r/>
+            <w:r>
+              <w:rPr>
+                <w:sz w:val="16"/>
+              </w:rPr>
+              <w:t>19 / 41</w:t>
+            </w:r>
+          </w:p>
+        </w:tc>
+        <w:tc>
+          <w:tcPr>
+            <w:tcW w:type="dxa" w:w="1247"/>
+          </w:tcPr>
+          <w:p>
+            <w:r/>
+            <w:r>
+              <w:rPr>
+                <w:sz w:val="16"/>
+              </w:rPr>
+              <w:t>41 de 41</w:t>
+            </w:r>
+          </w:p>
+        </w:tc>
+      </w:tr>
+    </w:tbl>
+    <w:p>
+      <w:r>
+        <w:t>Cobertura de sentencias que logran solo las pruebas unitarias sobre cada archivo de reglas de negocio (caja blanca):</w:t>
+      </w:r>
+    </w:p>
+    <w:tbl>
+      <w:tblPr>
+        <w:tblStyle w:val="TableGrid"/>
+        <w:tblW w:type="auto" w:w="0"/>
+        <w:tblLook w:firstColumn="1" w:firstRow="1" w:lastColumn="0" w:lastRow="0" w:noHBand="0" w:noVBand="1" w:val="04A0"/>
+      </w:tblPr>
+      <w:tblGrid>
+        <w:gridCol w:w="2440"/>
+        <w:gridCol w:w="2440"/>
+        <w:gridCol w:w="2440"/>
+        <w:gridCol w:w="2440"/>
+      </w:tblGrid>
+      <w:tr>
+        <w:tc>
+          <w:tcPr>
+            <w:tcW w:type="dxa" w:w="4535"/>
+            <w:shd w:val="clear" w:color="auto" w:fill="F5DED5"/>
+          </w:tcPr>
+          <w:p>
+            <w:r/>
+            <w:r>
+              <w:rPr>
+                <w:b/>
+                <w:sz w:val="18"/>
+              </w:rPr>
+              <w:t>Archivo (unidades)</w:t>
+            </w:r>
+          </w:p>
+        </w:tc>
+        <w:tc>
+          <w:tcPr>
+            <w:tcW w:type="dxa" w:w="1417"/>
+            <w:shd w:val="clear" w:color="auto" w:fill="F5DED5"/>
+          </w:tcPr>
+          <w:p>
+            <w:r/>
+            <w:r>
+              <w:rPr>
+                <w:b/>
+                <w:sz w:val="18"/>
+              </w:rPr>
+              <w:t>Sentencias</w:t>
+            </w:r>
+          </w:p>
+        </w:tc>
+        <w:tc>
+          <w:tcPr>
+            <w:tcW w:type="dxa" w:w="1417"/>
+            <w:shd w:val="clear" w:color="auto" w:fill="F5DED5"/>
+          </w:tcPr>
+          <w:p>
+            <w:r/>
+            <w:r>
+              <w:rPr>
+                <w:b/>
+                <w:sz w:val="18"/>
+              </w:rPr>
+              <w:t>Cubiertas</w:t>
+            </w:r>
+          </w:p>
+        </w:tc>
+        <w:tc>
+          <w:tcPr>
+            <w:tcW w:type="dxa" w:w="1701"/>
+            <w:shd w:val="clear" w:color="auto" w:fill="F5DED5"/>
+          </w:tcPr>
+          <w:p>
+            <w:r/>
+            <w:r>
+              <w:rPr>
+                <w:b/>
+                <w:sz w:val="18"/>
+              </w:rPr>
+              <w:t>Cobertura</w:t>
+            </w:r>
+          </w:p>
+        </w:tc>
+      </w:tr>
+      <w:tr>
+        <w:tc>
+          <w:tcPr>
+            <w:tcW w:type="dxa" w:w="4535"/>
+          </w:tcPr>
+          <w:p>
+            <w:r/>
+            <w:r>
+              <w:rPr>
+                <w:sz w:val="18"/>
+              </w:rPr>
+              <w:t>services/inventario.py (registrar_movimiento, numero)</w:t>
+            </w:r>
+          </w:p>
+        </w:tc>
+        <w:tc>
+          <w:tcPr>
+            <w:tcW w:type="dxa" w:w="1417"/>
+          </w:tcPr>
+          <w:p>
+            <w:r/>
+            <w:r>
+              <w:rPr>
+                <w:sz w:val="18"/>
+              </w:rPr>
+              <w:t>17</w:t>
+            </w:r>
+          </w:p>
+        </w:tc>
+        <w:tc>
+          <w:tcPr>
+            <w:tcW w:type="dxa" w:w="1417"/>
+          </w:tcPr>
+          <w:p>
+            <w:r/>
+            <w:r>
+              <w:rPr>
+                <w:sz w:val="18"/>
+              </w:rPr>
+              <w:t>17</w:t>
+            </w:r>
+          </w:p>
+        </w:tc>
+        <w:tc>
+          <w:tcPr>
+            <w:tcW w:type="dxa" w:w="1701"/>
+          </w:tcPr>
+          <w:p>
+            <w:r/>
+            <w:r>
+              <w:rPr>
+                <w:sz w:val="18"/>
+              </w:rPr>
+              <w:t>100 %</w:t>
+            </w:r>
+          </w:p>
+        </w:tc>
+      </w:tr>
+      <w:tr>
+        <w:tc>
+          <w:tcPr>
+            <w:tcW w:type="dxa" w:w="4535"/>
+          </w:tcPr>
+          <w:p>
+            <w:r/>
+            <w:r>
+              <w:rPr>
+                <w:sz w:val="18"/>
+              </w:rPr>
+              <w:t>utils/fechas.py (filtrar_por_fechas)</w:t>
+            </w:r>
+          </w:p>
+        </w:tc>
+        <w:tc>
+          <w:tcPr>
+            <w:tcW w:type="dxa" w:w="1417"/>
+          </w:tcPr>
+          <w:p>
+            <w:r/>
+            <w:r>
+              <w:rPr>
+                <w:sz w:val="18"/>
+              </w:rPr>
+              <w:t>7</w:t>
+            </w:r>
+          </w:p>
+        </w:tc>
+        <w:tc>
+          <w:tcPr>
+            <w:tcW w:type="dxa" w:w="1417"/>
+          </w:tcPr>
+          <w:p>
+            <w:r/>
+            <w:r>
+              <w:rPr>
+                <w:sz w:val="18"/>
+              </w:rPr>
+              <w:t>7</w:t>
+            </w:r>
+          </w:p>
+        </w:tc>
+        <w:tc>
+          <w:tcPr>
+            <w:tcW w:type="dxa" w:w="1701"/>
+          </w:tcPr>
+          <w:p>
+            <w:r/>
+            <w:r>
+              <w:rPr>
+                <w:sz w:val="18"/>
+              </w:rPr>
+              <w:t>100 %</w:t>
+            </w:r>
+          </w:p>
+        </w:tc>
+      </w:tr>
+      <w:tr>
+        <w:tc>
+          <w:tcPr>
+            <w:tcW w:type="dxa" w:w="4535"/>
+          </w:tcPr>
+          <w:p>
+            <w:r/>
+            <w:r>
+              <w:rPr>
+                <w:sz w:val="18"/>
+              </w:rPr>
+              <w:t>models/inventario.py (Insumo.estado_stock)</w:t>
+            </w:r>
+          </w:p>
+        </w:tc>
+        <w:tc>
+          <w:tcPr>
+            <w:tcW w:type="dxa" w:w="1417"/>
+          </w:tcPr>
+          <w:p>
+            <w:r/>
+            <w:r>
+              <w:rPr>
+                <w:sz w:val="18"/>
+              </w:rPr>
+              <w:t>41</w:t>
+            </w:r>
+          </w:p>
+        </w:tc>
+        <w:tc>
+          <w:tcPr>
+            <w:tcW w:type="dxa" w:w="1417"/>
+          </w:tcPr>
+          <w:p>
+            <w:r/>
+            <w:r>
+              <w:rPr>
+                <w:sz w:val="18"/>
+              </w:rPr>
+              <w:t>39</w:t>
+            </w:r>
+          </w:p>
+        </w:tc>
+        <w:tc>
+          <w:tcPr>
+            <w:tcW w:type="dxa" w:w="1701"/>
+          </w:tcPr>
+          <w:p>
+            <w:r/>
+            <w:r>
+              <w:rPr>
+                <w:sz w:val="18"/>
+              </w:rPr>
+              <w:t>95 %</w:t>
+            </w:r>
+          </w:p>
+        </w:tc>
+      </w:tr>
+      <w:tr>
+        <w:tc>
+          <w:tcPr>
+            <w:tcW w:type="dxa" w:w="4535"/>
+          </w:tcPr>
+          <w:p>
+            <w:r/>
+            <w:r>
+              <w:rPr>
+                <w:sz w:val="18"/>
+              </w:rPr>
+              <w:t>models/usuarios.py (contraseñas)</w:t>
+            </w:r>
+          </w:p>
+        </w:tc>
+        <w:tc>
+          <w:tcPr>
+            <w:tcW w:type="dxa" w:w="1417"/>
+          </w:tcPr>
+          <w:p>
+            <w:r/>
+            <w:r>
+              <w:rPr>
+                <w:sz w:val="18"/>
+              </w:rPr>
+              <w:t>41</w:t>
+            </w:r>
+          </w:p>
+        </w:tc>
+        <w:tc>
+          <w:tcPr>
+            <w:tcW w:type="dxa" w:w="1417"/>
+          </w:tcPr>
+          <w:p>
+            <w:r/>
+            <w:r>
+              <w:rPr>
+                <w:sz w:val="18"/>
+              </w:rPr>
+              <w:t>38</w:t>
+            </w:r>
+          </w:p>
+        </w:tc>
+        <w:tc>
+          <w:tcPr>
+            <w:tcW w:type="dxa" w:w="1701"/>
+          </w:tcPr>
+          <w:p>
+            <w:r/>
+            <w:r>
+              <w:rPr>
+                <w:sz w:val="18"/>
+              </w:rPr>
+              <w:t>93 %</w:t>
+            </w:r>
+          </w:p>
+        </w:tc>
+      </w:tr>
+      <w:tr>
+        <w:tc>
+          <w:tcPr>
+            <w:tcW w:type="dxa" w:w="4535"/>
+          </w:tcPr>
+          <w:p>
+            <w:r/>
+            <w:r>
+              <w:rPr>
+                <w:sz w:val="18"/>
+              </w:rPr>
+              <w:t>models/productos.py (costo y porciones)</w:t>
+            </w:r>
+          </w:p>
+        </w:tc>
+        <w:tc>
+          <w:tcPr>
+            <w:tcW w:type="dxa" w:w="1417"/>
+          </w:tcPr>
+          <w:p>
+            <w:r/>
+            <w:r>
+              <w:rPr>
+                <w:sz w:val="18"/>
+              </w:rPr>
+              <w:t>40</w:t>
+            </w:r>
+          </w:p>
+        </w:tc>
+        <w:tc>
+          <w:tcPr>
+            <w:tcW w:type="dxa" w:w="1417"/>
+          </w:tcPr>
+          <w:p>
+            <w:r/>
+            <w:r>
+              <w:rPr>
+                <w:sz w:val="18"/>
+              </w:rPr>
+              <w:t>35</w:t>
+            </w:r>
+          </w:p>
+        </w:tc>
+        <w:tc>
+          <w:tcPr>
+            <w:tcW w:type="dxa" w:w="1701"/>
+          </w:tcPr>
+          <w:p>
+            <w:r/>
+            <w:r>
+              <w:rPr>
+                <w:sz w:val="18"/>
+              </w:rPr>
+              <w:t>88 %</w:t>
+            </w:r>
+          </w:p>
+        </w:tc>
+      </w:tr>
+      <w:tr>
+        <w:tc>
+          <w:tcPr>
+            <w:tcW w:type="dxa" w:w="4535"/>
+          </w:tcPr>
+          <w:p>
+            <w:r/>
+            <w:r>
+              <w:rPr>
+                <w:sz w:val="18"/>
+              </w:rPr>
+              <w:t>services/ventas.py (estado y validaciones de pago)</w:t>
+            </w:r>
+          </w:p>
+        </w:tc>
+        <w:tc>
+          <w:tcPr>
+            <w:tcW w:type="dxa" w:w="1417"/>
+          </w:tcPr>
+          <w:p>
+            <w:r/>
+            <w:r>
+              <w:rPr>
+                <w:sz w:val="18"/>
+              </w:rPr>
+              <w:t>60</w:t>
+            </w:r>
+          </w:p>
+        </w:tc>
+        <w:tc>
+          <w:tcPr>
+            <w:tcW w:type="dxa" w:w="1417"/>
+          </w:tcPr>
+          <w:p>
+            <w:r/>
+            <w:r>
+              <w:rPr>
+                <w:sz w:val="18"/>
+              </w:rPr>
+              <w:t>29</w:t>
+            </w:r>
+          </w:p>
+        </w:tc>
+        <w:tc>
+          <w:tcPr>
+            <w:tcW w:type="dxa" w:w="1701"/>
+          </w:tcPr>
+          <w:p>
+            <w:r/>
+            <w:r>
+              <w:rPr>
+                <w:sz w:val="18"/>
+              </w:rPr>
+              <w:t>48 %</w:t>
+            </w:r>
+          </w:p>
+        </w:tc>
+      </w:tr>
+    </w:tbl>
+    <w:p>
+      <w:r>
+        <w:t>El servicio de inventario y el filtro de fechas quedan cubiertos al 100 % solo con pruebas unitarias. En el servicio de ventas las unitarias cubren el cálculo del estado y las validaciones del pago; el cierre de la venta (que descuenta inventario y guarda la venta en la base) se verifica en las pruebas de integración de pagos y ventas, donde la cobertura total del archivo llega al 100 %.</w:t>
+      </w:r>
+    </w:p>
+    <w:p>
+      <w:pPr>
+        <w:pStyle w:val="Heading2"/>
+      </w:pPr>
+      <w:r>
+        <w:t>5.6 Criterio de liberación y métricas</w:t>
+      </w:r>
+    </w:p>
+    <w:p>
+      <w:pPr>
+        <w:pStyle w:val="ListBullet"/>
+      </w:pPr>
+      <w:r>
+        <w:t>Una unidad se libera (se integra en develop) cuando todas sus pruebas unitarias pasan, la cobertura de sus sentencias es de al menos el 90 % sumando unitarias e integración, y la suite completa del proyecto sigue pasando. Hoy los archivos de reglas de negocio (models, services y utils) están todos al 100 %.</w:t>
+      </w:r>
+    </w:p>
+    <w:p>
+      <w:pPr>
+        <w:pStyle w:val="ListBullet"/>
+      </w:pPr>
+      <w:r>
+        <w:t>Métricas que se registran: número de casos y de ejecuciones, porcentaje de aprobación (41 de 41), cobertura de sentencias por archivo y tiempo de ejecución (0,48 s para toda la suite unitaria, lo que permite correrla con cada cambio).</w:t>
+      </w:r>
+    </w:p>
+    <w:p>
+      <w:pPr>
+        <w:pStyle w:val="ListBullet"/>
+      </w:pPr>
+      <w:r>
+        <w:t>Las pruebas unitarias no reemplazan la revisión: según estudios empíricos su efectividad ronda el 50 % de los defectos, por eso en StockPot se combinan con revisión del código en el Pull Request, pruebas de integración de la API y pruebas funcionales en la interfaz.</w:t>
+      </w:r>
+    </w:p>
+    <w:p>
+      <w:r>
+        <w:rPr>
+          <w:i/>
+          <w:sz w:val="18"/>
+        </w:rPr>
+        <w:t>Referencia: Ávila, A., Camilloni, L., Marotta, F., Vallespir, D. y Apa, C. «Pruebas unitarias en Java: JUnit y TestNG». Grupo de Ingeniería de Software, Universidad de la República (Uruguay).</w:t>
+      </w:r>
+    </w:p>
+    <w:p>
+      <w:pPr>
+        <w:pStyle w:val="Heading1"/>
+      </w:pPr>
+      <w:r>
+        <w:t>6. Entorno de pruebas</w:t>
       </w:r>
     </w:p>
     <w:tbl>
@@ -1281,7 +3749,7 @@
         <w:pStyle w:val="Heading1"/>
       </w:pPr>
       <w:r>
-        <w:t>6. Resultados de las pruebas automatizadas por módulo</w:t>
+        <w:t>7. Resultados de las pruebas automatizadas por módulo</w:t>
       </w:r>
     </w:p>
     <w:tbl>
@@ -1407,7 +3875,7 @@
               <w:rPr>
                 <w:sz w:val="18"/>
               </w:rPr>
-              <w:t>RF-01 Usuarios y roles</w:t>
+              <w:t>Pruebas unitarias (reglas de negocio)</w:t>
             </w:r>
           </w:p>
         </w:tc>
@@ -1421,7 +3889,7 @@
               <w:rPr>
                 <w:sz w:val="18"/>
               </w:rPr>
-              <w:t>43</w:t>
+              <w:t>19</w:t>
             </w:r>
           </w:p>
         </w:tc>
@@ -1435,7 +3903,7 @@
               <w:rPr>
                 <w:sz w:val="18"/>
               </w:rPr>
-              <w:t>43</w:t>
+              <w:t>41</w:t>
             </w:r>
           </w:p>
         </w:tc>
@@ -1449,7 +3917,7 @@
               <w:rPr>
                 <w:sz w:val="18"/>
               </w:rPr>
-              <w:t>43</w:t>
+              <w:t>41</w:t>
             </w:r>
           </w:p>
         </w:tc>
@@ -1463,7 +3931,7 @@
               <w:rPr>
                 <w:sz w:val="18"/>
               </w:rPr>
-              <w:t>7</w:t>
+              <w:t>0</w:t>
             </w:r>
           </w:p>
         </w:tc>
@@ -1493,7 +3961,7 @@
               <w:rPr>
                 <w:sz w:val="18"/>
               </w:rPr>
-              <w:t>RF-02 Proveedores y compras</w:t>
+              <w:t>RF-01 Usuarios y roles</w:t>
             </w:r>
           </w:p>
         </w:tc>
@@ -1521,7 +3989,7 @@
               <w:rPr>
                 <w:sz w:val="18"/>
               </w:rPr>
-              <w:t>51</w:t>
+              <w:t>43</w:t>
             </w:r>
           </w:p>
         </w:tc>
@@ -1535,7 +4003,7 @@
               <w:rPr>
                 <w:sz w:val="18"/>
               </w:rPr>
-              <w:t>51</w:t>
+              <w:t>43</w:t>
             </w:r>
           </w:p>
         </w:tc>
@@ -1549,7 +4017,7 @@
               <w:rPr>
                 <w:sz w:val="18"/>
               </w:rPr>
-              <w:t>4</w:t>
+              <w:t>7</w:t>
             </w:r>
           </w:p>
         </w:tc>
@@ -1579,7 +4047,7 @@
               <w:rPr>
                 <w:sz w:val="18"/>
               </w:rPr>
-              <w:t>RF-03 Inventario</w:t>
+              <w:t>RF-02 Proveedores y compras</w:t>
             </w:r>
           </w:p>
         </w:tc>
@@ -1593,7 +4061,7 @@
               <w:rPr>
                 <w:sz w:val="18"/>
               </w:rPr>
-              <w:t>30</w:t>
+              <w:t>43</w:t>
             </w:r>
           </w:p>
         </w:tc>
@@ -1607,7 +4075,7 @@
               <w:rPr>
                 <w:sz w:val="18"/>
               </w:rPr>
-              <w:t>32</w:t>
+              <w:t>51</w:t>
             </w:r>
           </w:p>
         </w:tc>
@@ -1621,7 +4089,7 @@
               <w:rPr>
                 <w:sz w:val="18"/>
               </w:rPr>
-              <w:t>32</w:t>
+              <w:t>51</w:t>
             </w:r>
           </w:p>
         </w:tc>
@@ -1665,7 +4133,7 @@
               <w:rPr>
                 <w:sz w:val="18"/>
               </w:rPr>
-              <w:t>RF-04 Productos y menú</w:t>
+              <w:t>RF-03 Inventario</w:t>
             </w:r>
           </w:p>
         </w:tc>
@@ -1679,7 +4147,7 @@
               <w:rPr>
                 <w:sz w:val="18"/>
               </w:rPr>
-              <w:t>14</w:t>
+              <w:t>30</w:t>
             </w:r>
           </w:p>
         </w:tc>
@@ -1693,7 +4161,7 @@
               <w:rPr>
                 <w:sz w:val="18"/>
               </w:rPr>
-              <w:t>21</w:t>
+              <w:t>32</w:t>
             </w:r>
           </w:p>
         </w:tc>
@@ -1707,7 +4175,7 @@
               <w:rPr>
                 <w:sz w:val="18"/>
               </w:rPr>
-              <w:t>21</w:t>
+              <w:t>32</w:t>
             </w:r>
           </w:p>
         </w:tc>
@@ -1721,7 +4189,7 @@
               <w:rPr>
                 <w:sz w:val="18"/>
               </w:rPr>
-              <w:t>1</w:t>
+              <w:t>4</w:t>
             </w:r>
           </w:p>
         </w:tc>
@@ -1751,7 +4219,7 @@
               <w:rPr>
                 <w:sz w:val="18"/>
               </w:rPr>
-              <w:t>RF-08 Domicilios</w:t>
+              <w:t>RF-04 Productos y menú</w:t>
             </w:r>
           </w:p>
         </w:tc>
@@ -1765,7 +4233,7 @@
               <w:rPr>
                 <w:sz w:val="18"/>
               </w:rPr>
-              <w:t>19</w:t>
+              <w:t>14</w:t>
             </w:r>
           </w:p>
         </w:tc>
@@ -1779,7 +4247,7 @@
               <w:rPr>
                 <w:sz w:val="18"/>
               </w:rPr>
-              <w:t>24</w:t>
+              <w:t>21</w:t>
             </w:r>
           </w:p>
         </w:tc>
@@ -1793,7 +4261,7 @@
               <w:rPr>
                 <w:sz w:val="18"/>
               </w:rPr>
-              <w:t>24</w:t>
+              <w:t>21</w:t>
             </w:r>
           </w:p>
         </w:tc>
@@ -1837,7 +4305,7 @@
               <w:rPr>
                 <w:sz w:val="18"/>
               </w:rPr>
-              <w:t>RF-09 Pagos</w:t>
+              <w:t>RF-08 Domicilios</w:t>
             </w:r>
           </w:p>
         </w:tc>
@@ -1851,7 +4319,7 @@
               <w:rPr>
                 <w:sz w:val="18"/>
               </w:rPr>
-              <w:t>11</w:t>
+              <w:t>19</w:t>
             </w:r>
           </w:p>
         </w:tc>
@@ -1865,7 +4333,7 @@
               <w:rPr>
                 <w:sz w:val="18"/>
               </w:rPr>
-              <w:t>15</w:t>
+              <w:t>24</w:t>
             </w:r>
           </w:p>
         </w:tc>
@@ -1879,7 +4347,7 @@
               <w:rPr>
                 <w:sz w:val="18"/>
               </w:rPr>
-              <w:t>15</w:t>
+              <w:t>24</w:t>
             </w:r>
           </w:p>
         </w:tc>
@@ -1923,7 +4391,7 @@
               <w:rPr>
                 <w:sz w:val="18"/>
               </w:rPr>
-              <w:t>RF-10 Ventas y consumo</w:t>
+              <w:t>RF-09 Pagos</w:t>
             </w:r>
           </w:p>
         </w:tc>
@@ -1937,7 +4405,7 @@
               <w:rPr>
                 <w:sz w:val="18"/>
               </w:rPr>
-              <w:t>9</w:t>
+              <w:t>11</w:t>
             </w:r>
           </w:p>
         </w:tc>
@@ -1951,7 +4419,7 @@
               <w:rPr>
                 <w:sz w:val="18"/>
               </w:rPr>
-              <w:t>10</w:t>
+              <w:t>15</w:t>
             </w:r>
           </w:p>
         </w:tc>
@@ -1965,7 +4433,7 @@
               <w:rPr>
                 <w:sz w:val="18"/>
               </w:rPr>
-              <w:t>10</w:t>
+              <w:t>15</w:t>
             </w:r>
           </w:p>
         </w:tc>
@@ -2009,7 +4477,7 @@
               <w:rPr>
                 <w:sz w:val="18"/>
               </w:rPr>
-              <w:t>RF-11 Reportes y estadísticas</w:t>
+              <w:t>RF-10 Ventas y consumo</w:t>
             </w:r>
           </w:p>
         </w:tc>
@@ -2095,7 +4563,7 @@
               <w:rPr>
                 <w:sz w:val="18"/>
               </w:rPr>
-              <w:t>Servidor web e interfaz</w:t>
+              <w:t>RF-11 Reportes y estadísticas</w:t>
             </w:r>
           </w:p>
         </w:tc>
@@ -2109,7 +4577,7 @@
               <w:rPr>
                 <w:sz w:val="18"/>
               </w:rPr>
-              <w:t>8</w:t>
+              <w:t>9</w:t>
             </w:r>
           </w:p>
         </w:tc>
@@ -2123,7 +4591,7 @@
               <w:rPr>
                 <w:sz w:val="18"/>
               </w:rPr>
-              <w:t>20</w:t>
+              <w:t>10</w:t>
             </w:r>
           </w:p>
         </w:tc>
@@ -2137,7 +4605,7 @@
               <w:rPr>
                 <w:sz w:val="18"/>
               </w:rPr>
-              <w:t>20</w:t>
+              <w:t>10</w:t>
             </w:r>
           </w:p>
         </w:tc>
@@ -2151,7 +4619,7 @@
               <w:rPr>
                 <w:sz w:val="18"/>
               </w:rPr>
-              <w:t>0</w:t>
+              <w:t>1</w:t>
             </w:r>
           </w:p>
         </w:tc>
@@ -2181,6 +4649,92 @@
               <w:rPr>
                 <w:sz w:val="18"/>
               </w:rPr>
+              <w:t>Servidor web e interfaz</w:t>
+            </w:r>
+          </w:p>
+        </w:tc>
+        <w:tc>
+          <w:tcPr>
+            <w:tcW w:type="dxa" w:w="1020"/>
+          </w:tcPr>
+          <w:p>
+            <w:r/>
+            <w:r>
+              <w:rPr>
+                <w:sz w:val="18"/>
+              </w:rPr>
+              <w:t>8</w:t>
+            </w:r>
+          </w:p>
+        </w:tc>
+        <w:tc>
+          <w:tcPr>
+            <w:tcW w:type="dxa" w:w="1247"/>
+          </w:tcPr>
+          <w:p>
+            <w:r/>
+            <w:r>
+              <w:rPr>
+                <w:sz w:val="18"/>
+              </w:rPr>
+              <w:t>20</w:t>
+            </w:r>
+          </w:p>
+        </w:tc>
+        <w:tc>
+          <w:tcPr>
+            <w:tcW w:type="dxa" w:w="1247"/>
+          </w:tcPr>
+          <w:p>
+            <w:r/>
+            <w:r>
+              <w:rPr>
+                <w:sz w:val="18"/>
+              </w:rPr>
+              <w:t>20</w:t>
+            </w:r>
+          </w:p>
+        </w:tc>
+        <w:tc>
+          <w:tcPr>
+            <w:tcW w:type="dxa" w:w="1247"/>
+          </w:tcPr>
+          <w:p>
+            <w:r/>
+            <w:r>
+              <w:rPr>
+                <w:sz w:val="18"/>
+              </w:rPr>
+              <w:t>0</w:t>
+            </w:r>
+          </w:p>
+        </w:tc>
+        <w:tc>
+          <w:tcPr>
+            <w:tcW w:type="dxa" w:w="1020"/>
+          </w:tcPr>
+          <w:p>
+            <w:r/>
+            <w:r>
+              <w:rPr>
+                <w:sz w:val="18"/>
+              </w:rPr>
+              <w:t>100 %</w:t>
+            </w:r>
+          </w:p>
+        </w:tc>
+      </w:tr>
+      <w:tr>
+        <w:tc>
+          <w:tcPr>
+            <w:tcW w:type="dxa" w:w="3402"/>
+          </w:tcPr>
+          <w:p>
+            <w:r/>
+            <w:r>
+              <w:rPr>
+                <w:sz w:val="18"/>
+              </w:rPr>
               <w:t>TOTAL</w:t>
             </w:r>
           </w:p>
@@ -2195,7 +4749,7 @@
               <w:rPr>
                 <w:sz w:val="18"/>
               </w:rPr>
-              <w:t>186</w:t>
+              <w:t>205</w:t>
             </w:r>
           </w:p>
         </w:tc>
@@ -2209,7 +4763,7 @@
               <w:rPr>
                 <w:sz w:val="18"/>
               </w:rPr>
-              <w:t>226</w:t>
+              <w:t>267</w:t>
             </w:r>
           </w:p>
         </w:tc>
@@ -2223,7 +4777,7 @@
               <w:rPr>
                 <w:sz w:val="18"/>
               </w:rPr>
-              <w:t>226</w:t>
+              <w:t>267</w:t>
             </w:r>
           </w:p>
         </w:tc>
@@ -2262,7 +4816,7 @@
         <w:pStyle w:val="Heading1"/>
       </w:pPr>
       <w:r>
-        <w:t>7. Cobertura de código</w:t>
+        <w:t>8. Cobertura de código</w:t>
       </w:r>
     </w:p>
     <w:p>
@@ -2992,7 +5546,7 @@
         <w:pStyle w:val="Heading1"/>
       </w:pPr>
       <w:r>
-        <w:t>8. Pruebas funcionales CRUD (caja negra)</w:t>
+        <w:t>9. Pruebas funcionales CRUD (caja negra)</w:t>
       </w:r>
     </w:p>
     <w:p>
@@ -3606,7 +6160,7 @@
         <w:pStyle w:val="Heading1"/>
       </w:pPr>
       <w:r>
-        <w:t>9. Rendimiento</w:t>
+        <w:t>10. Rendimiento</w:t>
       </w:r>
     </w:p>
     <w:tbl>
@@ -4165,7 +6719,7 @@
         <w:pStyle w:val="Heading1"/>
       </w:pPr>
       <w:r>
-        <w:t>10. Defectos encontrados y su resolución</w:t>
+        <w:t>11. Defectos encontrados y su resolución</w:t>
       </w:r>
     </w:p>
     <w:tbl>
@@ -4917,7 +7471,7 @@
         <w:pStyle w:val="Heading1"/>
       </w:pPr>
       <w:r>
-        <w:t>11. Conclusiones y recomendaciones</w:t>
+        <w:t>12. Conclusiones y recomendaciones</w:t>
       </w:r>
     </w:p>
     <w:p>
@@ -16429,6 +18983,1374 @@
                 <w:sz w:val="15"/>
               </w:rPr>
               <w:t>1</w:t>
+            </w:r>
+          </w:p>
+        </w:tc>
+        <w:tc>
+          <w:tcPr>
+            <w:tcW w:type="dxa" w:w="1020"/>
+          </w:tcPr>
+          <w:p>
+            <w:r/>
+            <w:r>
+              <w:rPr>
+                <w:sz w:val="15"/>
+              </w:rPr>
+              <w:t>Aprobada</w:t>
+            </w:r>
+          </w:p>
+        </w:tc>
+      </w:tr>
+      <w:tr>
+        <w:tc>
+          <w:tcPr>
+            <w:tcW w:type="dxa" w:w="1247"/>
+          </w:tcPr>
+          <w:p>
+            <w:r/>
+            <w:r>
+              <w:rPr>
+                <w:sz w:val="15"/>
+              </w:rPr>
+              <w:t>CPU-03.8-1</w:t>
+            </w:r>
+          </w:p>
+        </w:tc>
+        <w:tc>
+          <w:tcPr>
+            <w:tcW w:type="dxa" w:w="1361"/>
+          </w:tcPr>
+          <w:p>
+            <w:r/>
+            <w:r>
+              <w:rPr>
+                <w:sz w:val="15"/>
+              </w:rPr>
+              <w:t>RF-03.8</w:t>
+            </w:r>
+          </w:p>
+        </w:tc>
+        <w:tc>
+          <w:tcPr>
+            <w:tcW w:type="dxa" w:w="4876"/>
+          </w:tcPr>
+          <w:p>
+            <w:r/>
+            <w:r>
+              <w:rPr>
+                <w:sz w:val="15"/>
+              </w:rPr>
+              <w:t>Insumo.estado_stock clasifica AGOTADO / BAJO / OK en los valores límite.</w:t>
+            </w:r>
+          </w:p>
+        </w:tc>
+        <w:tc>
+          <w:tcPr>
+            <w:tcW w:type="dxa" w:w="680"/>
+          </w:tcPr>
+          <w:p>
+            <w:r/>
+            <w:r>
+              <w:rPr>
+                <w:sz w:val="15"/>
+              </w:rPr>
+              <w:t>6</w:t>
+            </w:r>
+          </w:p>
+        </w:tc>
+        <w:tc>
+          <w:tcPr>
+            <w:tcW w:type="dxa" w:w="1020"/>
+          </w:tcPr>
+          <w:p>
+            <w:r/>
+            <w:r>
+              <w:rPr>
+                <w:sz w:val="15"/>
+              </w:rPr>
+              <w:t>Aprobada</w:t>
+            </w:r>
+          </w:p>
+        </w:tc>
+      </w:tr>
+      <w:tr>
+        <w:tc>
+          <w:tcPr>
+            <w:tcW w:type="dxa" w:w="1247"/>
+          </w:tcPr>
+          <w:p>
+            <w:r/>
+            <w:r>
+              <w:rPr>
+                <w:sz w:val="15"/>
+              </w:rPr>
+              <w:t>CPU-03.4-1</w:t>
+            </w:r>
+          </w:p>
+        </w:tc>
+        <w:tc>
+          <w:tcPr>
+            <w:tcW w:type="dxa" w:w="1361"/>
+          </w:tcPr>
+          <w:p>
+            <w:r/>
+            <w:r>
+              <w:rPr>
+                <w:sz w:val="15"/>
+              </w:rPr>
+              <w:t>RF-03.4</w:t>
+            </w:r>
+          </w:p>
+        </w:tc>
+        <w:tc>
+          <w:tcPr>
+            <w:tcW w:type="dxa" w:w="4876"/>
+          </w:tcPr>
+          <w:p>
+            <w:r/>
+            <w:r>
+              <w:rPr>
+                <w:sz w:val="15"/>
+              </w:rPr>
+              <w:t>Una ENTRADA suma al stock y deja el movimiento con el stock resultante.</w:t>
+            </w:r>
+          </w:p>
+        </w:tc>
+        <w:tc>
+          <w:tcPr>
+            <w:tcW w:type="dxa" w:w="680"/>
+          </w:tcPr>
+          <w:p>
+            <w:r/>
+            <w:r>
+              <w:rPr>
+                <w:sz w:val="15"/>
+              </w:rPr>
+              <w:t>1</w:t>
+            </w:r>
+          </w:p>
+        </w:tc>
+        <w:tc>
+          <w:tcPr>
+            <w:tcW w:type="dxa" w:w="1020"/>
+          </w:tcPr>
+          <w:p>
+            <w:r/>
+            <w:r>
+              <w:rPr>
+                <w:sz w:val="15"/>
+              </w:rPr>
+              <w:t>Aprobada</w:t>
+            </w:r>
+          </w:p>
+        </w:tc>
+      </w:tr>
+      <w:tr>
+        <w:tc>
+          <w:tcPr>
+            <w:tcW w:type="dxa" w:w="1247"/>
+          </w:tcPr>
+          <w:p>
+            <w:r/>
+            <w:r>
+              <w:rPr>
+                <w:sz w:val="15"/>
+              </w:rPr>
+              <w:t>CPU-03.5-1</w:t>
+            </w:r>
+          </w:p>
+        </w:tc>
+        <w:tc>
+          <w:tcPr>
+            <w:tcW w:type="dxa" w:w="1361"/>
+          </w:tcPr>
+          <w:p>
+            <w:r/>
+            <w:r>
+              <w:rPr>
+                <w:sz w:val="15"/>
+              </w:rPr>
+              <w:t>RF-03.5</w:t>
+            </w:r>
+          </w:p>
+        </w:tc>
+        <w:tc>
+          <w:tcPr>
+            <w:tcW w:type="dxa" w:w="4876"/>
+          </w:tcPr>
+          <w:p>
+            <w:r/>
+            <w:r>
+              <w:rPr>
+                <w:sz w:val="15"/>
+              </w:rPr>
+              <w:t>Una SALIDA puede dejar el stock exactamente en cero (valor límite).</w:t>
+            </w:r>
+          </w:p>
+        </w:tc>
+        <w:tc>
+          <w:tcPr>
+            <w:tcW w:type="dxa" w:w="680"/>
+          </w:tcPr>
+          <w:p>
+            <w:r/>
+            <w:r>
+              <w:rPr>
+                <w:sz w:val="15"/>
+              </w:rPr>
+              <w:t>1</w:t>
+            </w:r>
+          </w:p>
+        </w:tc>
+        <w:tc>
+          <w:tcPr>
+            <w:tcW w:type="dxa" w:w="1020"/>
+          </w:tcPr>
+          <w:p>
+            <w:r/>
+            <w:r>
+              <w:rPr>
+                <w:sz w:val="15"/>
+              </w:rPr>
+              <w:t>Aprobada</w:t>
+            </w:r>
+          </w:p>
+        </w:tc>
+      </w:tr>
+      <w:tr>
+        <w:tc>
+          <w:tcPr>
+            <w:tcW w:type="dxa" w:w="1247"/>
+          </w:tcPr>
+          <w:p>
+            <w:r/>
+            <w:r>
+              <w:rPr>
+                <w:sz w:val="15"/>
+              </w:rPr>
+              <w:t>CPU-03.5-2</w:t>
+            </w:r>
+          </w:p>
+        </w:tc>
+        <w:tc>
+          <w:tcPr>
+            <w:tcW w:type="dxa" w:w="1361"/>
+          </w:tcPr>
+          <w:p>
+            <w:r/>
+            <w:r>
+              <w:rPr>
+                <w:sz w:val="15"/>
+              </w:rPr>
+              <w:t>RF-03.5</w:t>
+            </w:r>
+          </w:p>
+        </w:tc>
+        <w:tc>
+          <w:tcPr>
+            <w:tcW w:type="dxa" w:w="4876"/>
+          </w:tcPr>
+          <w:p>
+            <w:r/>
+            <w:r>
+              <w:rPr>
+                <w:sz w:val="15"/>
+              </w:rPr>
+              <w:t>Una SALIDA mayor al stock lanza StockInsuficiente y no cambia nada.</w:t>
+            </w:r>
+          </w:p>
+        </w:tc>
+        <w:tc>
+          <w:tcPr>
+            <w:tcW w:type="dxa" w:w="680"/>
+          </w:tcPr>
+          <w:p>
+            <w:r/>
+            <w:r>
+              <w:rPr>
+                <w:sz w:val="15"/>
+              </w:rPr>
+              <w:t>1</w:t>
+            </w:r>
+          </w:p>
+        </w:tc>
+        <w:tc>
+          <w:tcPr>
+            <w:tcW w:type="dxa" w:w="1020"/>
+          </w:tcPr>
+          <w:p>
+            <w:r/>
+            <w:r>
+              <w:rPr>
+                <w:sz w:val="15"/>
+              </w:rPr>
+              <w:t>Aprobada</w:t>
+            </w:r>
+          </w:p>
+        </w:tc>
+      </w:tr>
+      <w:tr>
+        <w:tc>
+          <w:tcPr>
+            <w:tcW w:type="dxa" w:w="1247"/>
+          </w:tcPr>
+          <w:p>
+            <w:r/>
+            <w:r>
+              <w:rPr>
+                <w:sz w:val="15"/>
+              </w:rPr>
+              <w:t>CPU-03.5-3</w:t>
+            </w:r>
+          </w:p>
+        </w:tc>
+        <w:tc>
+          <w:tcPr>
+            <w:tcW w:type="dxa" w:w="1361"/>
+          </w:tcPr>
+          <w:p>
+            <w:r/>
+            <w:r>
+              <w:rPr>
+                <w:sz w:val="15"/>
+              </w:rPr>
+              <w:t>RF-03.5</w:t>
+            </w:r>
+          </w:p>
+        </w:tc>
+        <w:tc>
+          <w:tcPr>
+            <w:tcW w:type="dxa" w:w="4876"/>
+          </w:tcPr>
+          <w:p>
+            <w:r/>
+            <w:r>
+              <w:rPr>
+                <w:sz w:val="15"/>
+              </w:rPr>
+              <w:t>Las cantidades usan Decimal: 0,1 + 0,2 da 0,3 exacto (sin error de float).</w:t>
+            </w:r>
+          </w:p>
+        </w:tc>
+        <w:tc>
+          <w:tcPr>
+            <w:tcW w:type="dxa" w:w="680"/>
+          </w:tcPr>
+          <w:p>
+            <w:r/>
+            <w:r>
+              <w:rPr>
+                <w:sz w:val="15"/>
+              </w:rPr>
+              <w:t>1</w:t>
+            </w:r>
+          </w:p>
+        </w:tc>
+        <w:tc>
+          <w:tcPr>
+            <w:tcW w:type="dxa" w:w="1020"/>
+          </w:tcPr>
+          <w:p>
+            <w:r/>
+            <w:r>
+              <w:rPr>
+                <w:sz w:val="15"/>
+              </w:rPr>
+              <w:t>Aprobada</w:t>
+            </w:r>
+          </w:p>
+        </w:tc>
+      </w:tr>
+      <w:tr>
+        <w:tc>
+          <w:tcPr>
+            <w:tcW w:type="dxa" w:w="1247"/>
+          </w:tcPr>
+          <w:p>
+            <w:r/>
+            <w:r>
+              <w:rPr>
+                <w:sz w:val="15"/>
+              </w:rPr>
+              <w:t>CPU-03.5-4</w:t>
+            </w:r>
+          </w:p>
+        </w:tc>
+        <w:tc>
+          <w:tcPr>
+            <w:tcW w:type="dxa" w:w="1361"/>
+          </w:tcPr>
+          <w:p>
+            <w:r/>
+            <w:r>
+              <w:rPr>
+                <w:sz w:val="15"/>
+              </w:rPr>
+              <w:t>RF-03.5</w:t>
+            </w:r>
+          </w:p>
+        </w:tc>
+        <w:tc>
+          <w:tcPr>
+            <w:tcW w:type="dxa" w:w="4876"/>
+          </w:tcPr>
+          <w:p>
+            <w:r/>
+            <w:r>
+              <w:rPr>
+                <w:sz w:val="15"/>
+              </w:rPr>
+              <w:t>numero() quita los ceros sobrantes de las cantidades en los mensajes.</w:t>
+            </w:r>
+          </w:p>
+        </w:tc>
+        <w:tc>
+          <w:tcPr>
+            <w:tcW w:type="dxa" w:w="680"/>
+          </w:tcPr>
+          <w:p>
+            <w:r/>
+            <w:r>
+              <w:rPr>
+                <w:sz w:val="15"/>
+              </w:rPr>
+              <w:t>3</w:t>
+            </w:r>
+          </w:p>
+        </w:tc>
+        <w:tc>
+          <w:tcPr>
+            <w:tcW w:type="dxa" w:w="1020"/>
+          </w:tcPr>
+          <w:p>
+            <w:r/>
+            <w:r>
+              <w:rPr>
+                <w:sz w:val="15"/>
+              </w:rPr>
+              <w:t>Aprobada</w:t>
+            </w:r>
+          </w:p>
+        </w:tc>
+      </w:tr>
+      <w:tr>
+        <w:tc>
+          <w:tcPr>
+            <w:tcW w:type="dxa" w:w="1247"/>
+          </w:tcPr>
+          <w:p>
+            <w:r/>
+            <w:r>
+              <w:rPr>
+                <w:sz w:val="15"/>
+              </w:rPr>
+              <w:t>CPU-04.4-1</w:t>
+            </w:r>
+          </w:p>
+        </w:tc>
+        <w:tc>
+          <w:tcPr>
+            <w:tcW w:type="dxa" w:w="1361"/>
+          </w:tcPr>
+          <w:p>
+            <w:r/>
+            <w:r>
+              <w:rPr>
+                <w:sz w:val="15"/>
+              </w:rPr>
+              <w:t>RF-04.4</w:t>
+            </w:r>
+          </w:p>
+        </w:tc>
+        <w:tc>
+          <w:tcPr>
+            <w:tcW w:type="dxa" w:w="4876"/>
+          </w:tcPr>
+          <w:p>
+            <w:r/>
+            <w:r>
+              <w:rPr>
+                <w:sz w:val="15"/>
+              </w:rPr>
+              <w:t>Producto.costo suma cantidad × costo unitario de cada insumo.</w:t>
+            </w:r>
+          </w:p>
+        </w:tc>
+        <w:tc>
+          <w:tcPr>
+            <w:tcW w:type="dxa" w:w="680"/>
+          </w:tcPr>
+          <w:p>
+            <w:r/>
+            <w:r>
+              <w:rPr>
+                <w:sz w:val="15"/>
+              </w:rPr>
+              <w:t>1</w:t>
+            </w:r>
+          </w:p>
+        </w:tc>
+        <w:tc>
+          <w:tcPr>
+            <w:tcW w:type="dxa" w:w="1020"/>
+          </w:tcPr>
+          <w:p>
+            <w:r/>
+            <w:r>
+              <w:rPr>
+                <w:sz w:val="15"/>
+              </w:rPr>
+              <w:t>Aprobada</w:t>
+            </w:r>
+          </w:p>
+        </w:tc>
+      </w:tr>
+      <w:tr>
+        <w:tc>
+          <w:tcPr>
+            <w:tcW w:type="dxa" w:w="1247"/>
+          </w:tcPr>
+          <w:p>
+            <w:r/>
+            <w:r>
+              <w:rPr>
+                <w:sz w:val="15"/>
+              </w:rPr>
+              <w:t>CPU-04.4-2</w:t>
+            </w:r>
+          </w:p>
+        </w:tc>
+        <w:tc>
+          <w:tcPr>
+            <w:tcW w:type="dxa" w:w="1361"/>
+          </w:tcPr>
+          <w:p>
+            <w:r/>
+            <w:r>
+              <w:rPr>
+                <w:sz w:val="15"/>
+              </w:rPr>
+              <w:t>RF-04.4</w:t>
+            </w:r>
+          </w:p>
+        </w:tc>
+        <w:tc>
+          <w:tcPr>
+            <w:tcW w:type="dxa" w:w="4876"/>
+          </w:tcPr>
+          <w:p>
+            <w:r/>
+            <w:r>
+              <w:rPr>
+                <w:sz w:val="15"/>
+              </w:rPr>
+              <w:t>porciones_posibles la limita el insumo que primero se acaba.</w:t>
+            </w:r>
+          </w:p>
+        </w:tc>
+        <w:tc>
+          <w:tcPr>
+            <w:tcW w:type="dxa" w:w="680"/>
+          </w:tcPr>
+          <w:p>
+            <w:r/>
+            <w:r>
+              <w:rPr>
+                <w:sz w:val="15"/>
+              </w:rPr>
+              <w:t>3</w:t>
+            </w:r>
+          </w:p>
+        </w:tc>
+        <w:tc>
+          <w:tcPr>
+            <w:tcW w:type="dxa" w:w="1020"/>
+          </w:tcPr>
+          <w:p>
+            <w:r/>
+            <w:r>
+              <w:rPr>
+                <w:sz w:val="15"/>
+              </w:rPr>
+              <w:t>Aprobada</w:t>
+            </w:r>
+          </w:p>
+        </w:tc>
+      </w:tr>
+      <w:tr>
+        <w:tc>
+          <w:tcPr>
+            <w:tcW w:type="dxa" w:w="1247"/>
+          </w:tcPr>
+          <w:p>
+            <w:r/>
+            <w:r>
+              <w:rPr>
+                <w:sz w:val="15"/>
+              </w:rPr>
+              <w:t>CPU-04.4-3</w:t>
+            </w:r>
+          </w:p>
+        </w:tc>
+        <w:tc>
+          <w:tcPr>
+            <w:tcW w:type="dxa" w:w="1361"/>
+          </w:tcPr>
+          <w:p>
+            <w:r/>
+            <w:r>
+              <w:rPr>
+                <w:sz w:val="15"/>
+              </w:rPr>
+              <w:t>RF-04.4</w:t>
+            </w:r>
+          </w:p>
+        </w:tc>
+        <w:tc>
+          <w:tcPr>
+            <w:tcW w:type="dxa" w:w="4876"/>
+          </w:tcPr>
+          <w:p>
+            <w:r/>
+            <w:r>
+              <w:rPr>
+                <w:sz w:val="15"/>
+              </w:rPr>
+              <w:t>Un producto sin receta no calcula porciones (None) y cuesta 0.</w:t>
+            </w:r>
+          </w:p>
+        </w:tc>
+        <w:tc>
+          <w:tcPr>
+            <w:tcW w:type="dxa" w:w="680"/>
+          </w:tcPr>
+          <w:p>
+            <w:r/>
+            <w:r>
+              <w:rPr>
+                <w:sz w:val="15"/>
+              </w:rPr>
+              <w:t>1</w:t>
+            </w:r>
+          </w:p>
+        </w:tc>
+        <w:tc>
+          <w:tcPr>
+            <w:tcW w:type="dxa" w:w="1020"/>
+          </w:tcPr>
+          <w:p>
+            <w:r/>
+            <w:r>
+              <w:rPr>
+                <w:sz w:val="15"/>
+              </w:rPr>
+              <w:t>Aprobada</w:t>
+            </w:r>
+          </w:p>
+        </w:tc>
+      </w:tr>
+      <w:tr>
+        <w:tc>
+          <w:tcPr>
+            <w:tcW w:type="dxa" w:w="1247"/>
+          </w:tcPr>
+          <w:p>
+            <w:r/>
+            <w:r>
+              <w:rPr>
+                <w:sz w:val="15"/>
+              </w:rPr>
+              <w:t>CPU-09.4-1</w:t>
+            </w:r>
+          </w:p>
+        </w:tc>
+        <w:tc>
+          <w:tcPr>
+            <w:tcW w:type="dxa" w:w="1361"/>
+          </w:tcPr>
+          <w:p>
+            <w:r/>
+            <w:r>
+              <w:rPr>
+                <w:sz w:val="15"/>
+              </w:rPr>
+              <w:t>RF-09.4</w:t>
+            </w:r>
+          </w:p>
+        </w:tc>
+        <w:tc>
+          <w:tcPr>
+            <w:tcW w:type="dxa" w:w="4876"/>
+          </w:tcPr>
+          <w:p>
+            <w:r/>
+            <w:r>
+              <w:rPr>
+                <w:sz w:val="15"/>
+              </w:rPr>
+              <w:t>estado_pago: PENDIENTE, PARCIAL o PAGADO según lo abonado.</w:t>
+            </w:r>
+          </w:p>
+        </w:tc>
+        <w:tc>
+          <w:tcPr>
+            <w:tcW w:type="dxa" w:w="680"/>
+          </w:tcPr>
+          <w:p>
+            <w:r/>
+            <w:r>
+              <w:rPr>
+                <w:sz w:val="15"/>
+              </w:rPr>
+              <w:t>5</w:t>
+            </w:r>
+          </w:p>
+        </w:tc>
+        <w:tc>
+          <w:tcPr>
+            <w:tcW w:type="dxa" w:w="1020"/>
+          </w:tcPr>
+          <w:p>
+            <w:r/>
+            <w:r>
+              <w:rPr>
+                <w:sz w:val="15"/>
+              </w:rPr>
+              <w:t>Aprobada</w:t>
+            </w:r>
+          </w:p>
+        </w:tc>
+      </w:tr>
+      <w:tr>
+        <w:tc>
+          <w:tcPr>
+            <w:tcW w:type="dxa" w:w="1247"/>
+          </w:tcPr>
+          <w:p>
+            <w:r/>
+            <w:r>
+              <w:rPr>
+                <w:sz w:val="15"/>
+              </w:rPr>
+              <w:t>CPU-09.4-2</w:t>
+            </w:r>
+          </w:p>
+        </w:tc>
+        <w:tc>
+          <w:tcPr>
+            <w:tcW w:type="dxa" w:w="1361"/>
+          </w:tcPr>
+          <w:p>
+            <w:r/>
+            <w:r>
+              <w:rPr>
+                <w:sz w:val="15"/>
+              </w:rPr>
+              <w:t>RF-09.4</w:t>
+            </w:r>
+          </w:p>
+        </w:tc>
+        <w:tc>
+          <w:tcPr>
+            <w:tcW w:type="dxa" w:w="4876"/>
+          </w:tcPr>
+          <w:p>
+            <w:r/>
+            <w:r>
+              <w:rPr>
+                <w:sz w:val="15"/>
+              </w:rPr>
+              <w:t>pagado() suma únicamente los pagos APROBADOS.</w:t>
+            </w:r>
+          </w:p>
+        </w:tc>
+        <w:tc>
+          <w:tcPr>
+            <w:tcW w:type="dxa" w:w="680"/>
+          </w:tcPr>
+          <w:p>
+            <w:r/>
+            <w:r>
+              <w:rPr>
+                <w:sz w:val="15"/>
+              </w:rPr>
+              <w:t>1</w:t>
+            </w:r>
+          </w:p>
+        </w:tc>
+        <w:tc>
+          <w:tcPr>
+            <w:tcW w:type="dxa" w:w="1020"/>
+          </w:tcPr>
+          <w:p>
+            <w:r/>
+            <w:r>
+              <w:rPr>
+                <w:sz w:val="15"/>
+              </w:rPr>
+              <w:t>Aprobada</w:t>
+            </w:r>
+          </w:p>
+        </w:tc>
+      </w:tr>
+      <w:tr>
+        <w:tc>
+          <w:tcPr>
+            <w:tcW w:type="dxa" w:w="1247"/>
+          </w:tcPr>
+          <w:p>
+            <w:r/>
+            <w:r>
+              <w:rPr>
+                <w:sz w:val="15"/>
+              </w:rPr>
+              <w:t>CPU-09.1-1</w:t>
+            </w:r>
+          </w:p>
+        </w:tc>
+        <w:tc>
+          <w:tcPr>
+            <w:tcW w:type="dxa" w:w="1361"/>
+          </w:tcPr>
+          <w:p>
+            <w:r/>
+            <w:r>
+              <w:rPr>
+                <w:sz w:val="15"/>
+              </w:rPr>
+              <w:t>RF-09.1, RF-09.2</w:t>
+            </w:r>
+          </w:p>
+        </w:tc>
+        <w:tc>
+          <w:tcPr>
+            <w:tcW w:type="dxa" w:w="4876"/>
+          </w:tcPr>
+          <w:p>
+            <w:r/>
+            <w:r>
+              <w:rPr>
+                <w:sz w:val="15"/>
+              </w:rPr>
+              <w:t>registrar_pago rechaza orden cerrada, método, monto y saldo inválidos.</w:t>
+            </w:r>
+          </w:p>
+        </w:tc>
+        <w:tc>
+          <w:tcPr>
+            <w:tcW w:type="dxa" w:w="680"/>
+          </w:tcPr>
+          <w:p>
+            <w:r/>
+            <w:r>
+              <w:rPr>
+                <w:sz w:val="15"/>
+              </w:rPr>
+              <w:t>4</w:t>
+            </w:r>
+          </w:p>
+        </w:tc>
+        <w:tc>
+          <w:tcPr>
+            <w:tcW w:type="dxa" w:w="1020"/>
+          </w:tcPr>
+          <w:p>
+            <w:r/>
+            <w:r>
+              <w:rPr>
+                <w:sz w:val="15"/>
+              </w:rPr>
+              <w:t>Aprobada</w:t>
+            </w:r>
+          </w:p>
+        </w:tc>
+      </w:tr>
+      <w:tr>
+        <w:tc>
+          <w:tcPr>
+            <w:tcW w:type="dxa" w:w="1247"/>
+          </w:tcPr>
+          <w:p>
+            <w:r/>
+            <w:r>
+              <w:rPr>
+                <w:sz w:val="15"/>
+              </w:rPr>
+              <w:t>CPU-09.2-1</w:t>
+            </w:r>
+          </w:p>
+        </w:tc>
+        <w:tc>
+          <w:tcPr>
+            <w:tcW w:type="dxa" w:w="1361"/>
+          </w:tcPr>
+          <w:p>
+            <w:r/>
+            <w:r>
+              <w:rPr>
+                <w:sz w:val="15"/>
+              </w:rPr>
+              <w:t>RF-09.2</w:t>
+            </w:r>
+          </w:p>
+        </w:tc>
+        <w:tc>
+          <w:tcPr>
+            <w:tcW w:type="dxa" w:w="4876"/>
+          </w:tcPr>
+          <w:p>
+            <w:r/>
+            <w:r>
+              <w:rPr>
+                <w:sz w:val="15"/>
+              </w:rPr>
+              <w:t>Los métodos de pago aceptados son efectivo, tarjeta y transferencia.</w:t>
+            </w:r>
+          </w:p>
+        </w:tc>
+        <w:tc>
+          <w:tcPr>
+            <w:tcW w:type="dxa" w:w="680"/>
+          </w:tcPr>
+          <w:p>
+            <w:r/>
+            <w:r>
+              <w:rPr>
+                <w:sz w:val="15"/>
+              </w:rPr>
+              <w:t>1</w:t>
+            </w:r>
+          </w:p>
+        </w:tc>
+        <w:tc>
+          <w:tcPr>
+            <w:tcW w:type="dxa" w:w="1020"/>
+          </w:tcPr>
+          <w:p>
+            <w:r/>
+            <w:r>
+              <w:rPr>
+                <w:sz w:val="15"/>
+              </w:rPr>
+              <w:t>Aprobada</w:t>
+            </w:r>
+          </w:p>
+        </w:tc>
+      </w:tr>
+      <w:tr>
+        <w:tc>
+          <w:tcPr>
+            <w:tcW w:type="dxa" w:w="1247"/>
+          </w:tcPr>
+          <w:p>
+            <w:r/>
+            <w:r>
+              <w:rPr>
+                <w:sz w:val="15"/>
+              </w:rPr>
+              <w:t>CPU-08.6-1</w:t>
+            </w:r>
+          </w:p>
+        </w:tc>
+        <w:tc>
+          <w:tcPr>
+            <w:tcW w:type="dxa" w:w="1361"/>
+          </w:tcPr>
+          <w:p>
+            <w:r/>
+            <w:r>
+              <w:rPr>
+                <w:sz w:val="15"/>
+              </w:rPr>
+              <w:t>RF-02.7, RF-08.6</w:t>
+            </w:r>
+          </w:p>
+        </w:tc>
+        <w:tc>
+          <w:tcPr>
+            <w:tcW w:type="dxa" w:w="4876"/>
+          </w:tcPr>
+          <w:p>
+            <w:r/>
+            <w:r>
+              <w:rPr>
+                <w:sz w:val="15"/>
+              </w:rPr>
+              <w:t>De un estado final no se puede pasar a ningún otro.</w:t>
+            </w:r>
+          </w:p>
+        </w:tc>
+        <w:tc>
+          <w:tcPr>
+            <w:tcW w:type="dxa" w:w="680"/>
+          </w:tcPr>
+          <w:p>
+            <w:r/>
+            <w:r>
+              <w:rPr>
+                <w:sz w:val="15"/>
+              </w:rPr>
+              <w:t>2</w:t>
+            </w:r>
+          </w:p>
+        </w:tc>
+        <w:tc>
+          <w:tcPr>
+            <w:tcW w:type="dxa" w:w="1020"/>
+          </w:tcPr>
+          <w:p>
+            <w:r/>
+            <w:r>
+              <w:rPr>
+                <w:sz w:val="15"/>
+              </w:rPr>
+              <w:t>Aprobada</w:t>
+            </w:r>
+          </w:p>
+        </w:tc>
+      </w:tr>
+      <w:tr>
+        <w:tc>
+          <w:tcPr>
+            <w:tcW w:type="dxa" w:w="1247"/>
+          </w:tcPr>
+          <w:p>
+            <w:r/>
+            <w:r>
+              <w:rPr>
+                <w:sz w:val="15"/>
+              </w:rPr>
+              <w:t>CPU-08.6-2</w:t>
+            </w:r>
+          </w:p>
+        </w:tc>
+        <w:tc>
+          <w:tcPr>
+            <w:tcW w:type="dxa" w:w="1361"/>
+          </w:tcPr>
+          <w:p>
+            <w:r/>
+            <w:r>
+              <w:rPr>
+                <w:sz w:val="15"/>
+              </w:rPr>
+              <w:t>RF-08.6</w:t>
+            </w:r>
+          </w:p>
+        </w:tc>
+        <w:tc>
+          <w:tcPr>
+            <w:tcW w:type="dxa" w:w="4876"/>
+          </w:tcPr>
+          <w:p>
+            <w:r/>
+            <w:r>
+              <w:rPr>
+                <w:sz w:val="15"/>
+              </w:rPr>
+              <w:t>Un domicilio avanza en orden: no puede volver a RECIBIDO.</w:t>
+            </w:r>
+          </w:p>
+        </w:tc>
+        <w:tc>
+          <w:tcPr>
+            <w:tcW w:type="dxa" w:w="680"/>
+          </w:tcPr>
+          <w:p>
+            <w:r/>
+            <w:r>
+              <w:rPr>
+                <w:sz w:val="15"/>
+              </w:rPr>
+              <w:t>1</w:t>
+            </w:r>
+          </w:p>
+        </w:tc>
+        <w:tc>
+          <w:tcPr>
+            <w:tcW w:type="dxa" w:w="1020"/>
+          </w:tcPr>
+          <w:p>
+            <w:r/>
+            <w:r>
+              <w:rPr>
+                <w:sz w:val="15"/>
+              </w:rPr>
+              <w:t>Aprobada</w:t>
+            </w:r>
+          </w:p>
+        </w:tc>
+      </w:tr>
+      <w:tr>
+        <w:tc>
+          <w:tcPr>
+            <w:tcW w:type="dxa" w:w="1247"/>
+          </w:tcPr>
+          <w:p>
+            <w:r/>
+            <w:r>
+              <w:rPr>
+                <w:sz w:val="15"/>
+              </w:rPr>
+              <w:t>CPU-01.1-1</w:t>
+            </w:r>
+          </w:p>
+        </w:tc>
+        <w:tc>
+          <w:tcPr>
+            <w:tcW w:type="dxa" w:w="1361"/>
+          </w:tcPr>
+          <w:p>
+            <w:r/>
+            <w:r>
+              <w:rPr>
+                <w:sz w:val="15"/>
+              </w:rPr>
+              <w:t>RF-01.1, RF-01.4</w:t>
+            </w:r>
+          </w:p>
+        </w:tc>
+        <w:tc>
+          <w:tcPr>
+            <w:tcW w:type="dxa" w:w="4876"/>
+          </w:tcPr>
+          <w:p>
+            <w:r/>
+            <w:r>
+              <w:rPr>
+                <w:sz w:val="15"/>
+              </w:rPr>
+              <w:t>La contraseña se guarda cifrada y solo valida la correcta.</w:t>
+            </w:r>
+          </w:p>
+        </w:tc>
+        <w:tc>
+          <w:tcPr>
+            <w:tcW w:type="dxa" w:w="680"/>
+          </w:tcPr>
+          <w:p>
+            <w:r/>
+            <w:r>
+              <w:rPr>
+                <w:sz w:val="15"/>
+              </w:rPr>
+              <w:t>1</w:t>
+            </w:r>
+          </w:p>
+        </w:tc>
+        <w:tc>
+          <w:tcPr>
+            <w:tcW w:type="dxa" w:w="1020"/>
+          </w:tcPr>
+          <w:p>
+            <w:r/>
+            <w:r>
+              <w:rPr>
+                <w:sz w:val="15"/>
+              </w:rPr>
+              <w:t>Aprobada</w:t>
+            </w:r>
+          </w:p>
+        </w:tc>
+      </w:tr>
+      <w:tr>
+        <w:tc>
+          <w:tcPr>
+            <w:tcW w:type="dxa" w:w="1247"/>
+          </w:tcPr>
+          <w:p>
+            <w:r/>
+            <w:r>
+              <w:rPr>
+                <w:sz w:val="15"/>
+              </w:rPr>
+              <w:t>CPU-01.1-2</w:t>
+            </w:r>
+          </w:p>
+        </w:tc>
+        <w:tc>
+          <w:tcPr>
+            <w:tcW w:type="dxa" w:w="1361"/>
+          </w:tcPr>
+          <w:p>
+            <w:r/>
+            <w:r>
+              <w:rPr>
+                <w:sz w:val="15"/>
+              </w:rPr>
+              <w:t>RF-01.1</w:t>
+            </w:r>
+          </w:p>
+        </w:tc>
+        <w:tc>
+          <w:tcPr>
+            <w:tcW w:type="dxa" w:w="4876"/>
+          </w:tcPr>
+          <w:p>
+            <w:r/>
+            <w:r>
+              <w:rPr>
+                <w:sz w:val="15"/>
+              </w:rPr>
+              <w:t>Dos usuarios con la misma contraseña tienen hashes distintos (sal aleatoria).</w:t>
+            </w:r>
+          </w:p>
+        </w:tc>
+        <w:tc>
+          <w:tcPr>
+            <w:tcW w:type="dxa" w:w="680"/>
+          </w:tcPr>
+          <w:p>
+            <w:r/>
+            <w:r>
+              <w:rPr>
+                <w:sz w:val="15"/>
+              </w:rPr>
+              <w:t>1</w:t>
+            </w:r>
+          </w:p>
+        </w:tc>
+        <w:tc>
+          <w:tcPr>
+            <w:tcW w:type="dxa" w:w="1020"/>
+          </w:tcPr>
+          <w:p>
+            <w:r/>
+            <w:r>
+              <w:rPr>
+                <w:sz w:val="15"/>
+              </w:rPr>
+              <w:t>Aprobada</w:t>
+            </w:r>
+          </w:p>
+        </w:tc>
+      </w:tr>
+      <w:tr>
+        <w:tc>
+          <w:tcPr>
+            <w:tcW w:type="dxa" w:w="1247"/>
+          </w:tcPr>
+          <w:p>
+            <w:r/>
+            <w:r>
+              <w:rPr>
+                <w:sz w:val="15"/>
+              </w:rPr>
+              <w:t>CPU-11.1-1</w:t>
+            </w:r>
+          </w:p>
+        </w:tc>
+        <w:tc>
+          <w:tcPr>
+            <w:tcW w:type="dxa" w:w="1361"/>
+          </w:tcPr>
+          <w:p>
+            <w:r/>
+            <w:r>
+              <w:rPr>
+                <w:sz w:val="15"/>
+              </w:rPr>
+              <w:t>RF-10.4, RF-11.2</w:t>
+            </w:r>
+          </w:p>
+        </w:tc>
+        <w:tc>
+          <w:tcPr>
+            <w:tcW w:type="dxa" w:w="4876"/>
+          </w:tcPr>
+          <w:p>
+            <w:r/>
+            <w:r>
+              <w:rPr>
+                <w:sz w:val="15"/>
+              </w:rPr>
+              <w:t>filtrar_por_fechas aplica ?desde y ?hasta, ambos incluidos.</w:t>
+            </w:r>
+          </w:p>
+        </w:tc>
+        <w:tc>
+          <w:tcPr>
+            <w:tcW w:type="dxa" w:w="680"/>
+          </w:tcPr>
+          <w:p>
+            <w:r/>
+            <w:r>
+              <w:rPr>
+                <w:sz w:val="15"/>
+              </w:rPr>
+              <w:t>4</w:t>
+            </w:r>
+          </w:p>
+        </w:tc>
+        <w:tc>
+          <w:tcPr>
+            <w:tcW w:type="dxa" w:w="1020"/>
+          </w:tcPr>
+          <w:p>
+            <w:r/>
+            <w:r>
+              <w:rPr>
+                <w:sz w:val="15"/>
+              </w:rPr>
+              <w:t>Aprobada</w:t>
+            </w:r>
+          </w:p>
+        </w:tc>
+      </w:tr>
+      <w:tr>
+        <w:tc>
+          <w:tcPr>
+            <w:tcW w:type="dxa" w:w="1247"/>
+          </w:tcPr>
+          <w:p>
+            <w:r/>
+            <w:r>
+              <w:rPr>
+                <w:sz w:val="15"/>
+              </w:rPr>
+              <w:t>CPU-11.1-2</w:t>
+            </w:r>
+          </w:p>
+        </w:tc>
+        <w:tc>
+          <w:tcPr>
+            <w:tcW w:type="dxa" w:w="1361"/>
+          </w:tcPr>
+          <w:p>
+            <w:r/>
+            <w:r>
+              <w:rPr>
+                <w:sz w:val="15"/>
+              </w:rPr>
+              <w:t>RF-11.2</w:t>
+            </w:r>
+          </w:p>
+        </w:tc>
+        <w:tc>
+          <w:tcPr>
+            <w:tcW w:type="dxa" w:w="4876"/>
+          </w:tcPr>
+          <w:p>
+            <w:r/>
+            <w:r>
+              <w:rPr>
+                <w:sz w:val="15"/>
+              </w:rPr>
+              <w:t>Una fecha que no es AAAA-MM-DD válida lanza ValueError.</w:t>
+            </w:r>
+          </w:p>
+        </w:tc>
+        <w:tc>
+          <w:tcPr>
+            <w:tcW w:type="dxa" w:w="680"/>
+          </w:tcPr>
+          <w:p>
+            <w:r/>
+            <w:r>
+              <w:rPr>
+                <w:sz w:val="15"/>
+              </w:rPr>
+              <w:t>3</w:t>
             </w:r>
           </w:p>
         </w:tc>

</xml_diff>